<commit_message>
Feat : Hachage de mot de passe + Option création de compte + Début de page Mes publications
</commit_message>
<xml_diff>
--- a/Rapport de projet 151.docx
+++ b/Rapport de projet 151.docx
@@ -1,6 +1,6 @@
 
 <file path=word/document.xml><?xml version="1.0" encoding="utf-8"?>
-<w:document xmlns:wpc="http://schemas.microsoft.com/office/word/2010/wordprocessingCanvas" xmlns:cx="http://schemas.microsoft.com/office/drawing/2014/chartex" xmlns:cx1="http://schemas.microsoft.com/office/drawing/2015/9/8/chartex" xmlns:cx2="http://schemas.microsoft.com/office/drawing/2015/10/21/chartex" xmlns:cx3="http://schemas.microsoft.com/office/drawing/2016/5/9/chartex" xmlns:cx4="http://schemas.microsoft.com/office/drawing/2016/5/10/chartex" xmlns:cx5="http://schemas.microsoft.com/office/drawing/2016/5/11/chartex" xmlns:cx6="http://schemas.microsoft.com/office/drawing/2016/5/12/chartex" xmlns:cx7="http://schemas.microsoft.com/office/drawing/2016/5/13/chartex" xmlns:cx8="http://schemas.microsoft.com/office/drawing/2016/5/14/chartex" xmlns:mc="http://schemas.openxmlformats.org/markup-compatibility/2006" xmlns:aink="http://schemas.microsoft.com/office/drawing/2016/ink" xmlns:am3d="http://schemas.microsoft.com/office/drawing/2017/model3d" xmlns:o="urn:schemas-microsoft-com:office:office" xmlns:oel="http://schemas.microsoft.com/office/2019/extlst" xmlns:r="http://schemas.openxmlformats.org/officeDocument/2006/relationships" xmlns:m="http://schemas.openxmlformats.org/officeDocument/2006/math" xmlns:v="urn:schemas-microsoft-com:vml" xmlns:wp14="http://schemas.microsoft.com/office/word/2010/wordprocessingDrawing" xmlns:wp="http://schemas.openxmlformats.org/drawingml/2006/wordprocessingDrawing" xmlns:w10="urn:schemas-microsoft-com:office:word" xmlns:w="http://schemas.openxmlformats.org/wordprocessingml/2006/main" xmlns:w14="http://schemas.microsoft.com/office/word/2010/wordml" xmlns:w15="http://schemas.microsoft.com/office/word/2012/wordml" xmlns:w16cex="http://schemas.microsoft.com/office/word/2018/wordml/cex" xmlns:w16cid="http://schemas.microsoft.com/office/word/2016/wordml/cid" xmlns:w16="http://schemas.microsoft.com/office/word/2018/wordml" xmlns:w16sdtdh="http://schemas.microsoft.com/office/word/2020/wordml/sdtdatahash" xmlns:w16se="http://schemas.microsoft.com/office/word/2015/wordml/symex" xmlns:wpg="http://schemas.microsoft.com/office/word/2010/wordprocessingGroup" xmlns:wpi="http://schemas.microsoft.com/office/word/2010/wordprocessingInk" xmlns:wne="http://schemas.microsoft.com/office/word/2006/wordml" xmlns:wps="http://schemas.microsoft.com/office/word/2010/wordprocessingShape" mc:Ignorable="w14 w15 w16se w16cid w16 w16cex w16sdtdh wp14">
+<w:document xmlns:wpc="http://schemas.microsoft.com/office/word/2010/wordprocessingCanvas" xmlns:cx="http://schemas.microsoft.com/office/drawing/2014/chartex" xmlns:cx1="http://schemas.microsoft.com/office/drawing/2015/9/8/chartex" xmlns:cx2="http://schemas.microsoft.com/office/drawing/2015/10/21/chartex" xmlns:cx3="http://schemas.microsoft.com/office/drawing/2016/5/9/chartex" xmlns:cx4="http://schemas.microsoft.com/office/drawing/2016/5/10/chartex" xmlns:cx5="http://schemas.microsoft.com/office/drawing/2016/5/11/chartex" xmlns:cx6="http://schemas.microsoft.com/office/drawing/2016/5/12/chartex" xmlns:cx7="http://schemas.microsoft.com/office/drawing/2016/5/13/chartex" xmlns:cx8="http://schemas.microsoft.com/office/drawing/2016/5/14/chartex" xmlns:mc="http://schemas.openxmlformats.org/markup-compatibility/2006" xmlns:aink="http://schemas.microsoft.com/office/drawing/2016/ink" xmlns:am3d="http://schemas.microsoft.com/office/drawing/2017/model3d" xmlns:o="urn:schemas-microsoft-com:office:office" xmlns:oel="http://schemas.microsoft.com/office/2019/extlst" xmlns:r="http://schemas.openxmlformats.org/officeDocument/2006/relationships" xmlns:m="http://schemas.openxmlformats.org/officeDocument/2006/math" xmlns:v="urn:schemas-microsoft-com:vml" xmlns:wp14="http://schemas.microsoft.com/office/word/2010/wordprocessingDrawing" xmlns:wp="http://schemas.openxmlformats.org/drawingml/2006/wordprocessingDrawing" xmlns:w10="urn:schemas-microsoft-com:office:word" xmlns:w="http://schemas.openxmlformats.org/wordprocessingml/2006/main" xmlns:w14="http://schemas.microsoft.com/office/word/2010/wordml" xmlns:w15="http://schemas.microsoft.com/office/word/2012/wordml" xmlns:w16cex="http://schemas.microsoft.com/office/word/2018/wordml/cex" xmlns:w16cid="http://schemas.microsoft.com/office/word/2016/wordml/cid" xmlns:w16="http://schemas.microsoft.com/office/word/2018/wordml" xmlns:w16du="http://schemas.microsoft.com/office/word/2023/wordml/word16du" xmlns:w16sdtdh="http://schemas.microsoft.com/office/word/2020/wordml/sdtdatahash" xmlns:w16se="http://schemas.microsoft.com/office/word/2015/wordml/symex" xmlns:wpg="http://schemas.microsoft.com/office/word/2010/wordprocessingGroup" xmlns:wpi="http://schemas.microsoft.com/office/word/2010/wordprocessingInk" xmlns:wne="http://schemas.microsoft.com/office/word/2006/wordml" xmlns:wps="http://schemas.microsoft.com/office/word/2010/wordprocessingShape" mc:Ignorable="w14 w15 w16se w16cid w16 w16cex w16sdtdh w16du wp14">
   <w:body>
     <w:p>
       <w:pPr>
@@ -1562,10 +1562,7 @@
       </w:pPr>
       <w:bookmarkStart w:id="14" w:name="_Toc183417742"/>
       <w:r>
-        <w:t>Conclusion</w:t>
-      </w:r>
-      <w:r>
-        <w:t xml:space="preserve"> personnelle</w:t>
+        <w:t>Conclusion personnelle</w:t>
       </w:r>
       <w:bookmarkEnd w:id="14"/>
     </w:p>
@@ -1584,63 +1581,67 @@
     <w:p>
       <w:pPr>
         <w:pStyle w:val="Titre1"/>
+        <w:rPr>
+          <w:lang w:val="de-CH"/>
+        </w:rPr>
       </w:pPr>
       <w:bookmarkStart w:id="16" w:name="_Toc183417744"/>
-      <w:r>
+      <w:proofErr w:type="spellStart"/>
+      <w:r>
+        <w:rPr>
+          <w:lang w:val="de-CH"/>
+        </w:rPr>
         <w:lastRenderedPageBreak/>
         <w:t>Webographie</w:t>
       </w:r>
       <w:bookmarkEnd w:id="16"/>
+      <w:proofErr w:type="spellEnd"/>
     </w:p>
     <w:p>
-      <w:pPr>
-        <w:rPr>
-          <w:lang w:val="en-GB"/>
-        </w:rPr>
-      </w:pPr>
-      <w:r>
-        <w:rPr>
-          <w:i/>
-          <w:iCs/>
-          <w:lang w:val="en-GB"/>
-        </w:rPr>
-        <w:t>Tailwind CSS</w:t>
-      </w:r>
-      <w:r>
-        <w:rPr>
-          <w:lang w:val="en-GB"/>
-        </w:rPr>
-        <w:t xml:space="preserve">, </w:t>
+      <w:proofErr w:type="spellStart"/>
+      <w:r>
+        <w:t>Tailwind</w:t>
+      </w:r>
+      <w:proofErr w:type="spellEnd"/>
+      <w:r>
+        <w:t xml:space="preserve"> CSS, </w:t>
       </w:r>
       <w:hyperlink r:id="rId8" w:history="1">
         <w:r>
           <w:rPr>
             <w:rStyle w:val="Lienhypertexte"/>
-            <w:lang w:val="en-GB"/>
+            <w:color w:val="4472C4" w:themeColor="accent1"/>
           </w:rPr>
-          <w:t>https://tailwindcss.com/docs/installation</w:t>
+          <w:t>https://tai</w:t>
+        </w:r>
+        <w:r>
+          <w:rPr>
+            <w:rStyle w:val="Lienhypertexte"/>
+            <w:color w:val="4472C4" w:themeColor="accent1"/>
+          </w:rPr>
+          <w:t>l</w:t>
+        </w:r>
+        <w:r>
+          <w:rPr>
+            <w:rStyle w:val="Lienhypertexte"/>
+            <w:color w:val="4472C4" w:themeColor="accent1"/>
+          </w:rPr>
+          <w:t>windcss.com/docs/installation</w:t>
         </w:r>
       </w:hyperlink>
       <w:r>
-        <w:rPr>
-          <w:lang w:val="en-GB"/>
-        </w:rPr>
         <w:t>,</w:t>
+      </w:r>
+      <w:r>
+        <w:t xml:space="preserve"> consulté le</w:t>
+      </w:r>
+      <w:r>
+        <w:t xml:space="preserve"> 29.11.2024</w:t>
       </w:r>
     </w:p>
     <w:p>
-      <w:pPr>
-        <w:rPr>
-          <w:i/>
-          <w:iCs/>
-        </w:rPr>
-      </w:pPr>
       <w:proofErr w:type="spellStart"/>
       <w:r>
-        <w:rPr>
-          <w:i/>
-          <w:iCs/>
-        </w:rPr>
         <w:t>TailwinUI</w:t>
       </w:r>
       <w:proofErr w:type="spellEnd"/>
@@ -1656,67 +1657,44 @@
         </w:r>
       </w:hyperlink>
       <w:r>
+        <w:t>, con</w:t>
+      </w:r>
+      <w:r>
+        <w:t>sulté le 29.11.2024</w:t>
+      </w:r>
+    </w:p>
+    <w:p>
+      <w:proofErr w:type="spellStart"/>
+      <w:r>
+        <w:t>ChatGPT</w:t>
+      </w:r>
+      <w:proofErr w:type="spellEnd"/>
+      <w:r>
         <w:t xml:space="preserve">, </w:t>
       </w:r>
-      <w:r>
-        <w:rPr>
-          <w:i/>
-          <w:iCs/>
-        </w:rPr>
-        <w:t xml:space="preserve"> </w:t>
+      <w:hyperlink r:id="rId10" w:history="1">
+        <w:r>
+          <w:rPr>
+            <w:rStyle w:val="Lienhypertexte"/>
+          </w:rPr>
+          <w:t>https://chatgpt.com</w:t>
+        </w:r>
+      </w:hyperlink>
+      <w:r>
+        <w:t>, cons</w:t>
+      </w:r>
+      <w:r>
+        <w:t>ulté le 29.11.2024</w:t>
       </w:r>
     </w:p>
     <w:p>
       <w:pPr>
         <w:rPr>
-          <w:i/>
-          <w:iCs/>
+          <w:rStyle w:val="Lienhypertexte"/>
         </w:rPr>
       </w:pPr>
-      <w:proofErr w:type="spellStart"/>
-      <w:r>
-        <w:rPr>
-          <w:i/>
-          <w:iCs/>
-        </w:rPr>
-        <w:t>ChatGPT</w:t>
-      </w:r>
-      <w:proofErr w:type="spellEnd"/>
-      <w:r>
-        <w:rPr>
-          <w:i/>
-          <w:iCs/>
-        </w:rPr>
-        <w:t xml:space="preserve">, </w:t>
-      </w:r>
-      <w:hyperlink r:id="rId10" w:history="1">
-        <w:r>
-          <w:rPr>
-            <w:rStyle w:val="Lienhypertexte"/>
-            <w:i/>
-            <w:iCs/>
-          </w:rPr>
-          <w:t>https://chatgpt.com</w:t>
-        </w:r>
-      </w:hyperlink>
-      <w:r>
-        <w:rPr>
-          <w:i/>
-          <w:iCs/>
-        </w:rPr>
-        <w:t>,</w:t>
-      </w:r>
-    </w:p>
-    <w:p>
-      <w:r>
-        <w:rPr>
-          <w:i/>
-          <w:iCs/>
-        </w:rPr>
-        <w:t>Icons8</w:t>
-      </w:r>
-      <w:r>
-        <w:t xml:space="preserve">, </w:t>
+      <w:r>
+        <w:t xml:space="preserve">Icons8, </w:t>
       </w:r>
       <w:hyperlink r:id="rId11" w:history="1">
         <w:r>
@@ -1726,15 +1704,188 @@
           <w:t>https://icons8.com/icons/new</w:t>
         </w:r>
       </w:hyperlink>
+      <w:r>
+        <w:t>, cons</w:t>
+      </w:r>
+      <w:r>
+        <w:t>ulté le 29.11.2024</w:t>
+      </w:r>
     </w:p>
-    <w:p/>
     <w:p>
       <w:pPr>
         <w:rPr>
-          <w:i/>
-          <w:iCs/>
+          <w:lang w:val="en-GB"/>
         </w:rPr>
       </w:pPr>
+      <w:r>
+        <w:rPr>
+          <w:lang w:val="en-GB"/>
+        </w:rPr>
+        <w:t>W3</w:t>
+      </w:r>
+      <w:r>
+        <w:rPr>
+          <w:lang w:val="en-GB"/>
+        </w:rPr>
+        <w:t xml:space="preserve">Schools, </w:t>
+      </w:r>
+      <w:hyperlink r:id="rId12" w:tgtFrame="_blank" w:history="1">
+        <w:r>
+          <w:rPr>
+            <w:rStyle w:val="Lienhypertexte"/>
+            <w:lang w:val="en-US"/>
+          </w:rPr>
+          <w:t xml:space="preserve">How </w:t>
+        </w:r>
+        <w:proofErr w:type="gramStart"/>
+        <w:r>
+          <w:rPr>
+            <w:rStyle w:val="Lienhypertexte"/>
+            <w:lang w:val="en-US"/>
+          </w:rPr>
+          <w:t>To</w:t>
+        </w:r>
+        <w:proofErr w:type="gramEnd"/>
+        <w:r>
+          <w:rPr>
+            <w:rStyle w:val="Lienhypertexte"/>
+            <w:lang w:val="en-US"/>
+          </w:rPr>
+          <w:t xml:space="preserve"> Create a Search Bar</w:t>
+        </w:r>
+      </w:hyperlink>
+      <w:r>
+        <w:rPr>
+          <w:lang w:val="en-US"/>
+        </w:rPr>
+        <w:t xml:space="preserve">, </w:t>
+      </w:r>
+      <w:proofErr w:type="spellStart"/>
+      <w:r>
+        <w:rPr>
+          <w:lang w:val="en-US"/>
+        </w:rPr>
+        <w:t>consulté</w:t>
+      </w:r>
+      <w:proofErr w:type="spellEnd"/>
+      <w:r>
+        <w:rPr>
+          <w:lang w:val="en-US"/>
+        </w:rPr>
+        <w:t xml:space="preserve"> le 25.11.2024</w:t>
+      </w:r>
+      <w:r>
+        <w:rPr>
+          <w:lang w:val="en-GB"/>
+        </w:rPr>
+        <w:t> </w:t>
+      </w:r>
+    </w:p>
+    <w:p>
+      <w:proofErr w:type="spellStart"/>
+      <w:r>
+        <w:t>Delf</w:t>
+      </w:r>
+      <w:r>
+        <w:t>S</w:t>
+      </w:r>
+      <w:r>
+        <w:t>tack</w:t>
+      </w:r>
+      <w:proofErr w:type="spellEnd"/>
+      <w:r>
+        <w:t xml:space="preserve">, </w:t>
+      </w:r>
+      <w:hyperlink r:id="rId13" w:anchor=":~:text=Dans%20ce%20tutoriel%2C%20nous%20visons%20%C3%A0%20apprendre%20%C3%A0,donn%C3%A9e%20comme%20SELECT%20IF%28condition%2C%20result_when_true%2C%20result_when_false%29%20AS%20%5Bcol_name%5D." w:history="1">
+        <w:r>
+          <w:rPr>
+            <w:rStyle w:val="Lienhypertexte"/>
+          </w:rPr>
+          <w:t>L'instructi</w:t>
+        </w:r>
+        <w:r>
+          <w:rPr>
+            <w:rStyle w:val="Lienhypertexte"/>
+          </w:rPr>
+          <w:t>o</w:t>
+        </w:r>
+        <w:r>
+          <w:rPr>
+            <w:rStyle w:val="Lienhypertexte"/>
+          </w:rPr>
+          <w:t>n IF dans MySQL | Delft Stack</w:t>
+        </w:r>
+      </w:hyperlink>
+      <w:r>
+        <w:t xml:space="preserve">, </w:t>
+      </w:r>
+      <w:r>
+        <w:t>consulté le</w:t>
+      </w:r>
+      <w:r>
+        <w:t xml:space="preserve"> </w:t>
+      </w:r>
+      <w:r>
+        <w:t>26.11.24</w:t>
+      </w:r>
+    </w:p>
+    <w:p>
+      <w:r>
+        <w:t>Learn</w:t>
+      </w:r>
+      <w:r>
+        <w:t>SQL.fr</w:t>
+      </w:r>
+      <w:r>
+        <w:t xml:space="preserve">, </w:t>
+      </w:r>
+      <w:hyperlink r:id="rId14" w:anchor=":~:text=Pour%20cr%C3%A9er%20des%20conditions%20de%20filtrage%20encore%20plus,en%20SQL%20%3A%20PAS%20%E2%86%92%20ET%20%E2%86%92%20OU." w:history="1">
+        <w:r>
+          <w:rPr>
+            <w:rStyle w:val="Lienhypertexte"/>
+          </w:rPr>
+          <w:t xml:space="preserve">Le guide </w:t>
+        </w:r>
+        <w:r>
+          <w:rPr>
+            <w:rStyle w:val="Lienhypertexte"/>
+          </w:rPr>
+          <w:t>c</w:t>
+        </w:r>
+        <w:r>
+          <w:rPr>
+            <w:rStyle w:val="Lienhypertexte"/>
+          </w:rPr>
+          <w:t>omplet de la clause WHERE en SQL | L</w:t>
+        </w:r>
+        <w:r>
+          <w:rPr>
+            <w:rStyle w:val="Lienhypertexte"/>
+          </w:rPr>
+          <w:t>e</w:t>
+        </w:r>
+        <w:r>
+          <w:rPr>
+            <w:rStyle w:val="Lienhypertexte"/>
+          </w:rPr>
+          <w:t>arnSQ</w:t>
+        </w:r>
+        <w:r>
+          <w:rPr>
+            <w:rStyle w:val="Lienhypertexte"/>
+          </w:rPr>
+          <w:t>L</w:t>
+        </w:r>
+        <w:r>
+          <w:rPr>
+            <w:rStyle w:val="Lienhypertexte"/>
+          </w:rPr>
+          <w:t>.fr</w:t>
+        </w:r>
+      </w:hyperlink>
+      <w:r>
+        <w:t>, 26.11.24</w:t>
+      </w:r>
     </w:p>
     <w:sectPr>
       <w:pgSz w:w="11906" w:h="16838"/>
@@ -1747,7 +1898,7 @@
 </file>
 
 <file path=word/styles.xml><?xml version="1.0" encoding="utf-8"?>
-<w:styles xmlns:mc="http://schemas.openxmlformats.org/markup-compatibility/2006" xmlns:r="http://schemas.openxmlformats.org/officeDocument/2006/relationships" xmlns:w="http://schemas.openxmlformats.org/wordprocessingml/2006/main" xmlns:w14="http://schemas.microsoft.com/office/word/2010/wordml" xmlns:w15="http://schemas.microsoft.com/office/word/2012/wordml" xmlns:w16cex="http://schemas.microsoft.com/office/word/2018/wordml/cex" xmlns:w16cid="http://schemas.microsoft.com/office/word/2016/wordml/cid" xmlns:w16="http://schemas.microsoft.com/office/word/2018/wordml" xmlns:w16sdtdh="http://schemas.microsoft.com/office/word/2020/wordml/sdtdatahash" xmlns:w16se="http://schemas.microsoft.com/office/word/2015/wordml/symex" mc:Ignorable="w14 w15 w16se w16cid w16 w16cex w16sdtdh">
+<w:styles xmlns:mc="http://schemas.openxmlformats.org/markup-compatibility/2006" xmlns:r="http://schemas.openxmlformats.org/officeDocument/2006/relationships" xmlns:w="http://schemas.openxmlformats.org/wordprocessingml/2006/main" xmlns:w14="http://schemas.microsoft.com/office/word/2010/wordml" xmlns:w15="http://schemas.microsoft.com/office/word/2012/wordml" xmlns:w16cex="http://schemas.microsoft.com/office/word/2018/wordml/cex" xmlns:w16cid="http://schemas.microsoft.com/office/word/2016/wordml/cid" xmlns:w16="http://schemas.microsoft.com/office/word/2018/wordml" xmlns:w16du="http://schemas.microsoft.com/office/word/2023/wordml/word16du" xmlns:w16sdtdh="http://schemas.microsoft.com/office/word/2020/wordml/sdtdatahash" xmlns:w16se="http://schemas.microsoft.com/office/word/2015/wordml/symex" mc:Ignorable="w14 w15 w16se w16cid w16 w16cex w16sdtdh w16du">
   <w:docDefaults>
     <w:rPrDefault>
       <w:rPr>
@@ -2204,7 +2355,6 @@
   <w:style w:type="character" w:default="1" w:styleId="Policepardfaut">
     <w:name w:val="Default Paragraph Font"/>
     <w:uiPriority w:val="1"/>
-    <w:semiHidden/>
     <w:unhideWhenUsed/>
   </w:style>
   <w:style w:type="table" w:default="1" w:styleId="TableauNormal">
@@ -2393,6 +2543,18 @@
     <w:rPr>
       <w:color w:val="605E5C"/>
       <w:shd w:val="clear" w:color="auto" w:fill="E1DFDD"/>
+    </w:rPr>
+  </w:style>
+  <w:style w:type="character" w:styleId="Lienhypertextesuivivisit">
+    <w:name w:val="FollowedHyperlink"/>
+    <w:basedOn w:val="Policepardfaut"/>
+    <w:uiPriority w:val="99"/>
+    <w:semiHidden/>
+    <w:unhideWhenUsed/>
+    <w:rsid w:val="007614AF"/>
+    <w:rPr>
+      <w:color w:val="954F72" w:themeColor="followedHyperlink"/>
+      <w:u w:val="single"/>
     </w:rPr>
   </w:style>
 </w:styles>
@@ -2694,12 +2856,7 @@
 </file>
 
 <file path=customXml/item1.xml><?xml version="1.0" encoding="utf-8"?>
-<?mso-contentType ?>
-<FormTemplates xmlns="http://schemas.microsoft.com/sharepoint/v3/contenttype/forms">
-  <Display>DocumentLibraryForm</Display>
-  <Edit>DocumentLibraryForm</Edit>
-  <New>DocumentLibraryForm</New>
-</FormTemplates>
+<b:Sources xmlns:b="http://schemas.openxmlformats.org/officeDocument/2006/bibliography" xmlns="http://schemas.openxmlformats.org/officeDocument/2006/bibliography" SelectedStyle="\APASixthEditionOfficeOnline.xsl" StyleName="APA" Version="6"/>
 </file>
 
 <file path=customXml/item2.xml><?xml version="1.0" encoding="utf-8"?>
@@ -2956,7 +3113,12 @@
 </file>
 
 <file path=customXml/item3.xml><?xml version="1.0" encoding="utf-8"?>
-<b:Sources xmlns:b="http://schemas.openxmlformats.org/officeDocument/2006/bibliography" xmlns="http://schemas.openxmlformats.org/officeDocument/2006/bibliography" SelectedStyle="\APASixthEditionOfficeOnline.xsl" StyleName="APA" Version="6"/>
+<?mso-contentType ?>
+<FormTemplates xmlns="http://schemas.microsoft.com/sharepoint/v3/contenttype/forms">
+  <Display>DocumentLibraryForm</Display>
+  <Edit>DocumentLibraryForm</Edit>
+  <New>DocumentLibraryForm</New>
+</FormTemplates>
 </file>
 
 <file path=customXml/item4.xml><?xml version="1.0" encoding="utf-8"?>
@@ -2968,9 +3130,9 @@
 </file>
 
 <file path=customXml/itemProps1.xml><?xml version="1.0" encoding="utf-8"?>
-<ds:datastoreItem xmlns:ds="http://schemas.openxmlformats.org/officeDocument/2006/customXml" ds:itemID="{B40BDD30-5C6F-4CE7-A239-E1CC62841014}">
+<ds:datastoreItem xmlns:ds="http://schemas.openxmlformats.org/officeDocument/2006/customXml" ds:itemID="{D0F41924-4BEF-4C66-BDA8-2632E4D4AC33}">
   <ds:schemaRefs>
-    <ds:schemaRef ds:uri="http://schemas.microsoft.com/sharepoint/v3/contenttype/forms"/>
+    <ds:schemaRef ds:uri="http://schemas.openxmlformats.org/officeDocument/2006/bibliography"/>
   </ds:schemaRefs>
 </ds:datastoreItem>
 </file>
@@ -2995,9 +3157,9 @@
 </file>
 
 <file path=customXml/itemProps3.xml><?xml version="1.0" encoding="utf-8"?>
-<ds:datastoreItem xmlns:ds="http://schemas.openxmlformats.org/officeDocument/2006/customXml" ds:itemID="{D0F41924-4BEF-4C66-BDA8-2632E4D4AC33}">
+<ds:datastoreItem xmlns:ds="http://schemas.openxmlformats.org/officeDocument/2006/customXml" ds:itemID="{B40BDD30-5C6F-4CE7-A239-E1CC62841014}">
   <ds:schemaRefs>
-    <ds:schemaRef ds:uri="http://schemas.openxmlformats.org/officeDocument/2006/bibliography"/>
+    <ds:schemaRef ds:uri="http://schemas.microsoft.com/sharepoint/v3/contenttype/forms"/>
   </ds:schemaRefs>
 </ds:datastoreItem>
 </file>

</xml_diff>

<commit_message>
fix : donne l'avis moyen et arrondi d'un ouvrage
</commit_message>
<xml_diff>
--- a/Rapport de projet 151.docx
+++ b/Rapport de projet 151.docx
@@ -1581,21 +1581,13 @@
     <w:p>
       <w:pPr>
         <w:pStyle w:val="Titre1"/>
-        <w:rPr>
-          <w:lang w:val="de-CH"/>
-        </w:rPr>
       </w:pPr>
       <w:bookmarkStart w:id="16" w:name="_Toc183417744"/>
-      <w:proofErr w:type="spellStart"/>
-      <w:r>
-        <w:rPr>
-          <w:lang w:val="de-CH"/>
-        </w:rPr>
+      <w:r>
         <w:lastRenderedPageBreak/>
         <w:t>Webographie</w:t>
       </w:r>
       <w:bookmarkEnd w:id="16"/>
-      <w:proofErr w:type="spellEnd"/>
     </w:p>
     <w:p>
       <w:proofErr w:type="spellStart"/>
@@ -1612,21 +1604,7 @@
             <w:rStyle w:val="Lienhypertexte"/>
             <w:color w:val="4472C4" w:themeColor="accent1"/>
           </w:rPr>
-          <w:t>https://tai</w:t>
-        </w:r>
-        <w:r>
-          <w:rPr>
-            <w:rStyle w:val="Lienhypertexte"/>
-            <w:color w:val="4472C4" w:themeColor="accent1"/>
-          </w:rPr>
-          <w:t>l</w:t>
-        </w:r>
-        <w:r>
-          <w:rPr>
-            <w:rStyle w:val="Lienhypertexte"/>
-            <w:color w:val="4472C4" w:themeColor="accent1"/>
-          </w:rPr>
-          <w:t>windcss.com/docs/installation</w:t>
+          <w:t>https://tailwindcss.com/docs/installation</w:t>
         </w:r>
       </w:hyperlink>
       <w:r>
@@ -1801,26 +1779,11 @@
           <w:rPr>
             <w:rStyle w:val="Lienhypertexte"/>
           </w:rPr>
-          <w:t>L'instructi</w:t>
-        </w:r>
-        <w:r>
-          <w:rPr>
-            <w:rStyle w:val="Lienhypertexte"/>
-          </w:rPr>
-          <w:t>o</w:t>
-        </w:r>
-        <w:r>
-          <w:rPr>
-            <w:rStyle w:val="Lienhypertexte"/>
-          </w:rPr>
-          <w:t>n IF dans MySQL | Delft Stack</w:t>
+          <w:t>L'instruction IF dans MySQL | Delft Stack</w:t>
         </w:r>
       </w:hyperlink>
       <w:r>
-        <w:t xml:space="preserve">, </w:t>
-      </w:r>
-      <w:r>
-        <w:t>consulté le</w:t>
+        <w:t>, consulté le</w:t>
       </w:r>
       <w:r>
         <w:t xml:space="preserve"> </w:t>
@@ -1844,49 +1807,34 @@
           <w:rPr>
             <w:rStyle w:val="Lienhypertexte"/>
           </w:rPr>
-          <w:t xml:space="preserve">Le guide </w:t>
+          <w:t>Le guide complet de la clause WHERE en SQL | LearnSQL.fr</w:t>
         </w:r>
+      </w:hyperlink>
+      <w:r>
+        <w:t>, 26.11.24</w:t>
+      </w:r>
+    </w:p>
+    <w:p>
+      <w:hyperlink r:id="rId15" w:history="1">
         <w:r>
           <w:rPr>
             <w:rStyle w:val="Lienhypertexte"/>
           </w:rPr>
-          <w:t>c</w:t>
+          <w:t>https://sql.sh/fonctions/agregation/avg</w:t>
         </w:r>
+      </w:hyperlink>
+    </w:p>
+    <w:p>
+      <w:hyperlink r:id="rId16" w:history="1">
         <w:r>
           <w:rPr>
             <w:rStyle w:val="Lienhypertexte"/>
           </w:rPr>
-          <w:t>omplet de la clause WHERE en SQL | L</w:t>
-        </w:r>
-        <w:r>
-          <w:rPr>
-            <w:rStyle w:val="Lienhypertexte"/>
-          </w:rPr>
-          <w:t>e</w:t>
-        </w:r>
-        <w:r>
-          <w:rPr>
-            <w:rStyle w:val="Lienhypertexte"/>
-          </w:rPr>
-          <w:t>arnSQ</w:t>
-        </w:r>
-        <w:r>
-          <w:rPr>
-            <w:rStyle w:val="Lienhypertexte"/>
-          </w:rPr>
-          <w:t>L</w:t>
-        </w:r>
-        <w:r>
-          <w:rPr>
-            <w:rStyle w:val="Lienhypertexte"/>
-          </w:rPr>
-          <w:t>.fr</w:t>
+          <w:t>https://sql.sh/fonctions/round</w:t>
         </w:r>
       </w:hyperlink>
-      <w:r>
-        <w:t>, 26.11.24</w:t>
-      </w:r>
     </w:p>
+    <w:p/>
     <w:sectPr>
       <w:pgSz w:w="11906" w:h="16838"/>
       <w:pgMar w:top="1417" w:right="1417" w:bottom="1417" w:left="1417" w:header="708" w:footer="708" w:gutter="0"/>
@@ -2355,6 +2303,7 @@
   <w:style w:type="character" w:default="1" w:styleId="Policepardfaut">
     <w:name w:val="Default Paragraph Font"/>
     <w:uiPriority w:val="1"/>
+    <w:semiHidden/>
     <w:unhideWhenUsed/>
   </w:style>
   <w:style w:type="table" w:default="1" w:styleId="TableauNormal">
@@ -2856,10 +2805,6 @@
 </file>
 
 <file path=customXml/item1.xml><?xml version="1.0" encoding="utf-8"?>
-<b:Sources xmlns:b="http://schemas.openxmlformats.org/officeDocument/2006/bibliography" xmlns="http://schemas.openxmlformats.org/officeDocument/2006/bibliography" SelectedStyle="\APASixthEditionOfficeOnline.xsl" StyleName="APA" Version="6"/>
-</file>
-
-<file path=customXml/item2.xml><?xml version="1.0" encoding="utf-8"?>
 <ct:contentTypeSchema xmlns:ct="http://schemas.microsoft.com/office/2006/metadata/contentType" xmlns:ma="http://schemas.microsoft.com/office/2006/metadata/properties/metaAttributes" ct:_="" ma:_="" ma:contentTypeName="Document" ma:contentTypeID="0x0101002111B0F6B9A4254395AB1DB111DB9386" ma:contentTypeVersion="18" ma:contentTypeDescription="Crée un document." ma:contentTypeScope="" ma:versionID="d9d6e71f22ffe43e2c52599b455c7b25">
   <xsd:schema xmlns:xsd="http://www.w3.org/2001/XMLSchema" xmlns:xs="http://www.w3.org/2001/XMLSchema" xmlns:p="http://schemas.microsoft.com/office/2006/metadata/properties" xmlns:ns3="b00ac6d6-80cd-413d-830d-913bbb25803f" xmlns:ns4="ee80aa89-3e9c-4f48-b6f7-2e434b001f62" targetNamespace="http://schemas.microsoft.com/office/2006/metadata/properties" ma:root="true" ma:fieldsID="ed733014cbd63336034cb6a2706260a3" ns3:_="" ns4:_="">
     <xsd:import namespace="b00ac6d6-80cd-413d-830d-913bbb25803f"/>
@@ -3112,7 +3057,19 @@
 </ct:contentTypeSchema>
 </file>
 
+<file path=customXml/item2.xml><?xml version="1.0" encoding="utf-8"?>
+<b:Sources xmlns:b="http://schemas.openxmlformats.org/officeDocument/2006/bibliography" xmlns="http://schemas.openxmlformats.org/officeDocument/2006/bibliography" SelectedStyle="\APASixthEditionOfficeOnline.xsl" StyleName="APA" Version="6"/>
+</file>
+
 <file path=customXml/item3.xml><?xml version="1.0" encoding="utf-8"?>
+<p:properties xmlns:p="http://schemas.microsoft.com/office/2006/metadata/properties" xmlns:xsi="http://www.w3.org/2001/XMLSchema-instance" xmlns:pc="http://schemas.microsoft.com/office/infopath/2007/PartnerControls">
+  <documentManagement>
+    <_activity xmlns="b00ac6d6-80cd-413d-830d-913bbb25803f" xsi:nil="true"/>
+  </documentManagement>
+</p:properties>
+</file>
+
+<file path=customXml/item4.xml><?xml version="1.0" encoding="utf-8"?>
 <?mso-contentType ?>
 <FormTemplates xmlns="http://schemas.microsoft.com/sharepoint/v3/contenttype/forms">
   <Display>DocumentLibraryForm</Display>
@@ -3121,23 +3078,7 @@
 </FormTemplates>
 </file>
 
-<file path=customXml/item4.xml><?xml version="1.0" encoding="utf-8"?>
-<p:properties xmlns:p="http://schemas.microsoft.com/office/2006/metadata/properties" xmlns:xsi="http://www.w3.org/2001/XMLSchema-instance" xmlns:pc="http://schemas.microsoft.com/office/infopath/2007/PartnerControls">
-  <documentManagement>
-    <_activity xmlns="b00ac6d6-80cd-413d-830d-913bbb25803f" xsi:nil="true"/>
-  </documentManagement>
-</p:properties>
-</file>
-
 <file path=customXml/itemProps1.xml><?xml version="1.0" encoding="utf-8"?>
-<ds:datastoreItem xmlns:ds="http://schemas.openxmlformats.org/officeDocument/2006/customXml" ds:itemID="{D0F41924-4BEF-4C66-BDA8-2632E4D4AC33}">
-  <ds:schemaRefs>
-    <ds:schemaRef ds:uri="http://schemas.openxmlformats.org/officeDocument/2006/bibliography"/>
-  </ds:schemaRefs>
-</ds:datastoreItem>
-</file>
-
-<file path=customXml/itemProps2.xml><?xml version="1.0" encoding="utf-8"?>
 <ds:datastoreItem xmlns:ds="http://schemas.openxmlformats.org/officeDocument/2006/customXml" ds:itemID="{C2DA5A2D-E6AE-4CF1-8B69-DF89A60A1EBF}">
   <ds:schemaRefs>
     <ds:schemaRef ds:uri="http://schemas.microsoft.com/office/2006/metadata/contentType"/>
@@ -3156,15 +3097,15 @@
 </ds:datastoreItem>
 </file>
 
-<file path=customXml/itemProps3.xml><?xml version="1.0" encoding="utf-8"?>
-<ds:datastoreItem xmlns:ds="http://schemas.openxmlformats.org/officeDocument/2006/customXml" ds:itemID="{B40BDD30-5C6F-4CE7-A239-E1CC62841014}">
+<file path=customXml/itemProps2.xml><?xml version="1.0" encoding="utf-8"?>
+<ds:datastoreItem xmlns:ds="http://schemas.openxmlformats.org/officeDocument/2006/customXml" ds:itemID="{D0F41924-4BEF-4C66-BDA8-2632E4D4AC33}">
   <ds:schemaRefs>
-    <ds:schemaRef ds:uri="http://schemas.microsoft.com/sharepoint/v3/contenttype/forms"/>
+    <ds:schemaRef ds:uri="http://schemas.openxmlformats.org/officeDocument/2006/bibliography"/>
   </ds:schemaRefs>
 </ds:datastoreItem>
 </file>
 
-<file path=customXml/itemProps4.xml><?xml version="1.0" encoding="utf-8"?>
+<file path=customXml/itemProps3.xml><?xml version="1.0" encoding="utf-8"?>
 <ds:datastoreItem xmlns:ds="http://schemas.openxmlformats.org/officeDocument/2006/customXml" ds:itemID="{E01C4D31-F5BF-4169-92BB-33EB44164409}">
   <ds:schemaRefs>
     <ds:schemaRef ds:uri="http://schemas.microsoft.com/office/2006/metadata/properties"/>
@@ -3172,4 +3113,12 @@
     <ds:schemaRef ds:uri="b00ac6d6-80cd-413d-830d-913bbb25803f"/>
   </ds:schemaRefs>
 </ds:datastoreItem>
+</file>
+
+<file path=customXml/itemProps4.xml><?xml version="1.0" encoding="utf-8"?>
+<ds:datastoreItem xmlns:ds="http://schemas.openxmlformats.org/officeDocument/2006/customXml" ds:itemID="{B40BDD30-5C6F-4CE7-A239-E1CC62841014}">
+  <ds:schemaRefs>
+    <ds:schemaRef ds:uri="http://schemas.microsoft.com/sharepoint/v3/contenttype/forms"/>
+  </ds:schemaRefs>
+</ds:datastoreItem>
 </file>
</xml_diff>

<commit_message>
feat : Ajout bulle de commentaire + option supprimer et modifier ses livres
</commit_message>
<xml_diff>
--- a/Rapport de projet 151.docx
+++ b/Rapport de projet 151.docx
@@ -1,6 +1,6 @@
 
 <file path=word/document.xml><?xml version="1.0" encoding="utf-8"?>
-<w:document xmlns:wpc="http://schemas.microsoft.com/office/word/2010/wordprocessingCanvas" xmlns:cx="http://schemas.microsoft.com/office/drawing/2014/chartex" xmlns:cx1="http://schemas.microsoft.com/office/drawing/2015/9/8/chartex" xmlns:cx2="http://schemas.microsoft.com/office/drawing/2015/10/21/chartex" xmlns:cx3="http://schemas.microsoft.com/office/drawing/2016/5/9/chartex" xmlns:cx4="http://schemas.microsoft.com/office/drawing/2016/5/10/chartex" xmlns:cx5="http://schemas.microsoft.com/office/drawing/2016/5/11/chartex" xmlns:cx6="http://schemas.microsoft.com/office/drawing/2016/5/12/chartex" xmlns:cx7="http://schemas.microsoft.com/office/drawing/2016/5/13/chartex" xmlns:cx8="http://schemas.microsoft.com/office/drawing/2016/5/14/chartex" xmlns:mc="http://schemas.openxmlformats.org/markup-compatibility/2006" xmlns:aink="http://schemas.microsoft.com/office/drawing/2016/ink" xmlns:am3d="http://schemas.microsoft.com/office/drawing/2017/model3d" xmlns:o="urn:schemas-microsoft-com:office:office" xmlns:oel="http://schemas.microsoft.com/office/2019/extlst" xmlns:r="http://schemas.openxmlformats.org/officeDocument/2006/relationships" xmlns:m="http://schemas.openxmlformats.org/officeDocument/2006/math" xmlns:v="urn:schemas-microsoft-com:vml" xmlns:wp14="http://schemas.microsoft.com/office/word/2010/wordprocessingDrawing" xmlns:wp="http://schemas.openxmlformats.org/drawingml/2006/wordprocessingDrawing" xmlns:w10="urn:schemas-microsoft-com:office:word" xmlns:w="http://schemas.openxmlformats.org/wordprocessingml/2006/main" xmlns:w14="http://schemas.microsoft.com/office/word/2010/wordml" xmlns:w15="http://schemas.microsoft.com/office/word/2012/wordml" xmlns:w16cex="http://schemas.microsoft.com/office/word/2018/wordml/cex" xmlns:w16cid="http://schemas.microsoft.com/office/word/2016/wordml/cid" xmlns:w16="http://schemas.microsoft.com/office/word/2018/wordml" xmlns:w16du="http://schemas.microsoft.com/office/word/2023/wordml/word16du" xmlns:w16sdtdh="http://schemas.microsoft.com/office/word/2020/wordml/sdtdatahash" xmlns:w16se="http://schemas.microsoft.com/office/word/2015/wordml/symex" xmlns:wpg="http://schemas.microsoft.com/office/word/2010/wordprocessingGroup" xmlns:wpi="http://schemas.microsoft.com/office/word/2010/wordprocessingInk" xmlns:wne="http://schemas.microsoft.com/office/word/2006/wordml" xmlns:wps="http://schemas.microsoft.com/office/word/2010/wordprocessingShape" mc:Ignorable="w14 w15 w16se w16cid w16 w16cex w16sdtdh w16du wp14">
+<w:document xmlns:wpc="http://schemas.microsoft.com/office/word/2010/wordprocessingCanvas" xmlns:cx="http://schemas.microsoft.com/office/drawing/2014/chartex" xmlns:cx1="http://schemas.microsoft.com/office/drawing/2015/9/8/chartex" xmlns:cx2="http://schemas.microsoft.com/office/drawing/2015/10/21/chartex" xmlns:cx3="http://schemas.microsoft.com/office/drawing/2016/5/9/chartex" xmlns:cx4="http://schemas.microsoft.com/office/drawing/2016/5/10/chartex" xmlns:cx5="http://schemas.microsoft.com/office/drawing/2016/5/11/chartex" xmlns:cx6="http://schemas.microsoft.com/office/drawing/2016/5/12/chartex" xmlns:cx7="http://schemas.microsoft.com/office/drawing/2016/5/13/chartex" xmlns:cx8="http://schemas.microsoft.com/office/drawing/2016/5/14/chartex" xmlns:mc="http://schemas.openxmlformats.org/markup-compatibility/2006" xmlns:aink="http://schemas.microsoft.com/office/drawing/2016/ink" xmlns:am3d="http://schemas.microsoft.com/office/drawing/2017/model3d" xmlns:o="urn:schemas-microsoft-com:office:office" xmlns:oel="http://schemas.microsoft.com/office/2019/extlst" xmlns:r="http://schemas.openxmlformats.org/officeDocument/2006/relationships" xmlns:m="http://schemas.openxmlformats.org/officeDocument/2006/math" xmlns:v="urn:schemas-microsoft-com:vml" xmlns:wp14="http://schemas.microsoft.com/office/word/2010/wordprocessingDrawing" xmlns:wp="http://schemas.openxmlformats.org/drawingml/2006/wordprocessingDrawing" xmlns:w10="urn:schemas-microsoft-com:office:word" xmlns:w="http://schemas.openxmlformats.org/wordprocessingml/2006/main" xmlns:w14="http://schemas.microsoft.com/office/word/2010/wordml" xmlns:w15="http://schemas.microsoft.com/office/word/2012/wordml" xmlns:w16cex="http://schemas.microsoft.com/office/word/2018/wordml/cex" xmlns:w16cid="http://schemas.microsoft.com/office/word/2016/wordml/cid" xmlns:w16="http://schemas.microsoft.com/office/word/2018/wordml" xmlns:w16sdtdh="http://schemas.microsoft.com/office/word/2020/wordml/sdtdatahash" xmlns:w16se="http://schemas.microsoft.com/office/word/2015/wordml/symex" xmlns:wpg="http://schemas.microsoft.com/office/word/2010/wordprocessingGroup" xmlns:wpi="http://schemas.microsoft.com/office/word/2010/wordprocessingInk" xmlns:wne="http://schemas.microsoft.com/office/word/2006/wordml" xmlns:wps="http://schemas.microsoft.com/office/word/2010/wordprocessingShape" mc:Ignorable="w14 w15 w16se w16cid w16 w16cex w16sdtdh wp14">
   <w:body>
     <w:p>
       <w:pPr>
@@ -1590,13 +1590,8 @@
       <w:bookmarkEnd w:id="16"/>
     </w:p>
     <w:p>
-      <w:proofErr w:type="spellStart"/>
-      <w:r>
-        <w:t>Tailwind</w:t>
-      </w:r>
-      <w:proofErr w:type="spellEnd"/>
-      <w:r>
-        <w:t xml:space="preserve"> CSS, </w:t>
+      <w:r>
+        <w:t xml:space="preserve">Tailwind CSS, </w:t>
       </w:r>
       <w:hyperlink r:id="rId8" w:history="1">
         <w:r>
@@ -1618,13 +1613,8 @@
       </w:r>
     </w:p>
     <w:p>
-      <w:proofErr w:type="spellStart"/>
-      <w:r>
-        <w:t>TailwinUI</w:t>
-      </w:r>
-      <w:proofErr w:type="spellEnd"/>
-      <w:r>
-        <w:t xml:space="preserve">, </w:t>
+      <w:r>
+        <w:t xml:space="preserve">TailwinUI, </w:t>
       </w:r>
       <w:hyperlink r:id="rId9" w:history="1">
         <w:r>
@@ -1642,13 +1632,8 @@
       </w:r>
     </w:p>
     <w:p>
-      <w:proofErr w:type="spellStart"/>
-      <w:r>
-        <w:t>ChatGPT</w:t>
-      </w:r>
-      <w:proofErr w:type="spellEnd"/>
-      <w:r>
-        <w:t xml:space="preserve">, </w:t>
+      <w:r>
+        <w:t xml:space="preserve">ChatGPT, </w:t>
       </w:r>
       <w:hyperlink r:id="rId10" w:history="1">
         <w:r>
@@ -1713,23 +1698,7 @@
             <w:rStyle w:val="Lienhypertexte"/>
             <w:lang w:val="en-US"/>
           </w:rPr>
-          <w:t xml:space="preserve">How </w:t>
-        </w:r>
-        <w:proofErr w:type="gramStart"/>
-        <w:r>
-          <w:rPr>
-            <w:rStyle w:val="Lienhypertexte"/>
-            <w:lang w:val="en-US"/>
-          </w:rPr>
-          <w:t>To</w:t>
-        </w:r>
-        <w:proofErr w:type="gramEnd"/>
-        <w:r>
-          <w:rPr>
-            <w:rStyle w:val="Lienhypertexte"/>
-            <w:lang w:val="en-US"/>
-          </w:rPr>
-          <w:t xml:space="preserve"> Create a Search Bar</w:t>
+          <w:t>How To Create a Search Bar</w:t>
         </w:r>
       </w:hyperlink>
       <w:r>
@@ -1738,19 +1707,11 @@
         </w:rPr>
         <w:t xml:space="preserve">, </w:t>
       </w:r>
-      <w:proofErr w:type="spellStart"/>
       <w:r>
         <w:rPr>
           <w:lang w:val="en-US"/>
         </w:rPr>
-        <w:t>consulté</w:t>
-      </w:r>
-      <w:proofErr w:type="spellEnd"/>
-      <w:r>
-        <w:rPr>
-          <w:lang w:val="en-US"/>
-        </w:rPr>
-        <w:t xml:space="preserve"> le 25.11.2024</w:t>
+        <w:t>consulté le 25.11.2024</w:t>
       </w:r>
       <w:r>
         <w:rPr>
@@ -1760,7 +1721,6 @@
       </w:r>
     </w:p>
     <w:p>
-      <w:proofErr w:type="spellStart"/>
       <w:r>
         <w:t>Delf</w:t>
       </w:r>
@@ -1768,11 +1728,7 @@
         <w:t>S</w:t>
       </w:r>
       <w:r>
-        <w:t>tack</w:t>
-      </w:r>
-      <w:proofErr w:type="spellEnd"/>
-      <w:r>
-        <w:t xml:space="preserve">, </w:t>
+        <w:t xml:space="preserve">tack, </w:t>
       </w:r>
       <w:hyperlink r:id="rId13" w:anchor=":~:text=Dans%20ce%20tutoriel%2C%20nous%20visons%20%C3%A0%20apprendre%20%C3%A0,donn%C3%A9e%20comme%20SELECT%20IF%28condition%2C%20result_when_true%2C%20result_when_false%29%20AS%20%5Bcol_name%5D." w:history="1">
         <w:r>
@@ -1825,6 +1781,11 @@
       </w:hyperlink>
     </w:p>
     <w:p>
+      <w:pPr>
+        <w:rPr>
+          <w:rStyle w:val="Lienhypertexte"/>
+        </w:rPr>
+      </w:pPr>
       <w:hyperlink r:id="rId16" w:history="1">
         <w:r>
           <w:rPr>
@@ -1834,6 +1795,17 @@
         </w:r>
       </w:hyperlink>
     </w:p>
+    <w:p>
+      <w:hyperlink r:id="rId17" w:history="1">
+        <w:r>
+          <w:rPr>
+            <w:rStyle w:val="Lienhypertexte"/>
+          </w:rPr>
+          <w:t>https://www.php.net/manual/fr/function.strlen.php</w:t>
+        </w:r>
+      </w:hyperlink>
+    </w:p>
+    <w:p/>
     <w:p/>
     <w:sectPr>
       <w:pgSz w:w="11906" w:h="16838"/>
@@ -1846,7 +1818,7 @@
 </file>
 
 <file path=word/styles.xml><?xml version="1.0" encoding="utf-8"?>
-<w:styles xmlns:mc="http://schemas.openxmlformats.org/markup-compatibility/2006" xmlns:r="http://schemas.openxmlformats.org/officeDocument/2006/relationships" xmlns:w="http://schemas.openxmlformats.org/wordprocessingml/2006/main" xmlns:w14="http://schemas.microsoft.com/office/word/2010/wordml" xmlns:w15="http://schemas.microsoft.com/office/word/2012/wordml" xmlns:w16cex="http://schemas.microsoft.com/office/word/2018/wordml/cex" xmlns:w16cid="http://schemas.microsoft.com/office/word/2016/wordml/cid" xmlns:w16="http://schemas.microsoft.com/office/word/2018/wordml" xmlns:w16du="http://schemas.microsoft.com/office/word/2023/wordml/word16du" xmlns:w16sdtdh="http://schemas.microsoft.com/office/word/2020/wordml/sdtdatahash" xmlns:w16se="http://schemas.microsoft.com/office/word/2015/wordml/symex" mc:Ignorable="w14 w15 w16se w16cid w16 w16cex w16sdtdh w16du">
+<w:styles xmlns:mc="http://schemas.openxmlformats.org/markup-compatibility/2006" xmlns:r="http://schemas.openxmlformats.org/officeDocument/2006/relationships" xmlns:w="http://schemas.openxmlformats.org/wordprocessingml/2006/main" xmlns:w14="http://schemas.microsoft.com/office/word/2010/wordml" xmlns:w15="http://schemas.microsoft.com/office/word/2012/wordml" xmlns:w16cex="http://schemas.microsoft.com/office/word/2018/wordml/cex" xmlns:w16cid="http://schemas.microsoft.com/office/word/2016/wordml/cid" xmlns:w16="http://schemas.microsoft.com/office/word/2018/wordml" xmlns:w16sdtdh="http://schemas.microsoft.com/office/word/2020/wordml/sdtdatahash" xmlns:w16se="http://schemas.microsoft.com/office/word/2015/wordml/symex" mc:Ignorable="w14 w15 w16se w16cid w16 w16cex w16sdtdh">
   <w:docDefaults>
     <w:rPrDefault>
       <w:rPr>
@@ -2805,6 +2777,10 @@
 </file>
 
 <file path=customXml/item1.xml><?xml version="1.0" encoding="utf-8"?>
+<b:Sources xmlns:b="http://schemas.openxmlformats.org/officeDocument/2006/bibliography" xmlns="http://schemas.openxmlformats.org/officeDocument/2006/bibliography" SelectedStyle="\APASixthEditionOfficeOnline.xsl" StyleName="APA" Version="6"/>
+</file>
+
+<file path=customXml/item2.xml><?xml version="1.0" encoding="utf-8"?>
 <ct:contentTypeSchema xmlns:ct="http://schemas.microsoft.com/office/2006/metadata/contentType" xmlns:ma="http://schemas.microsoft.com/office/2006/metadata/properties/metaAttributes" ct:_="" ma:_="" ma:contentTypeName="Document" ma:contentTypeID="0x0101002111B0F6B9A4254395AB1DB111DB9386" ma:contentTypeVersion="18" ma:contentTypeDescription="Crée un document." ma:contentTypeScope="" ma:versionID="d9d6e71f22ffe43e2c52599b455c7b25">
   <xsd:schema xmlns:xsd="http://www.w3.org/2001/XMLSchema" xmlns:xs="http://www.w3.org/2001/XMLSchema" xmlns:p="http://schemas.microsoft.com/office/2006/metadata/properties" xmlns:ns3="b00ac6d6-80cd-413d-830d-913bbb25803f" xmlns:ns4="ee80aa89-3e9c-4f48-b6f7-2e434b001f62" targetNamespace="http://schemas.microsoft.com/office/2006/metadata/properties" ma:root="true" ma:fieldsID="ed733014cbd63336034cb6a2706260a3" ns3:_="" ns4:_="">
     <xsd:import namespace="b00ac6d6-80cd-413d-830d-913bbb25803f"/>
@@ -3057,19 +3033,7 @@
 </ct:contentTypeSchema>
 </file>
 
-<file path=customXml/item2.xml><?xml version="1.0" encoding="utf-8"?>
-<b:Sources xmlns:b="http://schemas.openxmlformats.org/officeDocument/2006/bibliography" xmlns="http://schemas.openxmlformats.org/officeDocument/2006/bibliography" SelectedStyle="\APASixthEditionOfficeOnline.xsl" StyleName="APA" Version="6"/>
-</file>
-
 <file path=customXml/item3.xml><?xml version="1.0" encoding="utf-8"?>
-<p:properties xmlns:p="http://schemas.microsoft.com/office/2006/metadata/properties" xmlns:xsi="http://www.w3.org/2001/XMLSchema-instance" xmlns:pc="http://schemas.microsoft.com/office/infopath/2007/PartnerControls">
-  <documentManagement>
-    <_activity xmlns="b00ac6d6-80cd-413d-830d-913bbb25803f" xsi:nil="true"/>
-  </documentManagement>
-</p:properties>
-</file>
-
-<file path=customXml/item4.xml><?xml version="1.0" encoding="utf-8"?>
 <?mso-contentType ?>
 <FormTemplates xmlns="http://schemas.microsoft.com/sharepoint/v3/contenttype/forms">
   <Display>DocumentLibraryForm</Display>
@@ -3078,7 +3042,23 @@
 </FormTemplates>
 </file>
 
+<file path=customXml/item4.xml><?xml version="1.0" encoding="utf-8"?>
+<p:properties xmlns:p="http://schemas.microsoft.com/office/2006/metadata/properties" xmlns:xsi="http://www.w3.org/2001/XMLSchema-instance" xmlns:pc="http://schemas.microsoft.com/office/infopath/2007/PartnerControls">
+  <documentManagement>
+    <_activity xmlns="b00ac6d6-80cd-413d-830d-913bbb25803f" xsi:nil="true"/>
+  </documentManagement>
+</p:properties>
+</file>
+
 <file path=customXml/itemProps1.xml><?xml version="1.0" encoding="utf-8"?>
+<ds:datastoreItem xmlns:ds="http://schemas.openxmlformats.org/officeDocument/2006/customXml" ds:itemID="{D0F41924-4BEF-4C66-BDA8-2632E4D4AC33}">
+  <ds:schemaRefs>
+    <ds:schemaRef ds:uri="http://schemas.openxmlformats.org/officeDocument/2006/bibliography"/>
+  </ds:schemaRefs>
+</ds:datastoreItem>
+</file>
+
+<file path=customXml/itemProps2.xml><?xml version="1.0" encoding="utf-8"?>
 <ds:datastoreItem xmlns:ds="http://schemas.openxmlformats.org/officeDocument/2006/customXml" ds:itemID="{C2DA5A2D-E6AE-4CF1-8B69-DF89A60A1EBF}">
   <ds:schemaRefs>
     <ds:schemaRef ds:uri="http://schemas.microsoft.com/office/2006/metadata/contentType"/>
@@ -3097,15 +3077,15 @@
 </ds:datastoreItem>
 </file>
 
-<file path=customXml/itemProps2.xml><?xml version="1.0" encoding="utf-8"?>
-<ds:datastoreItem xmlns:ds="http://schemas.openxmlformats.org/officeDocument/2006/customXml" ds:itemID="{D0F41924-4BEF-4C66-BDA8-2632E4D4AC33}">
+<file path=customXml/itemProps3.xml><?xml version="1.0" encoding="utf-8"?>
+<ds:datastoreItem xmlns:ds="http://schemas.openxmlformats.org/officeDocument/2006/customXml" ds:itemID="{B40BDD30-5C6F-4CE7-A239-E1CC62841014}">
   <ds:schemaRefs>
-    <ds:schemaRef ds:uri="http://schemas.openxmlformats.org/officeDocument/2006/bibliography"/>
+    <ds:schemaRef ds:uri="http://schemas.microsoft.com/sharepoint/v3/contenttype/forms"/>
   </ds:schemaRefs>
 </ds:datastoreItem>
 </file>
 
-<file path=customXml/itemProps3.xml><?xml version="1.0" encoding="utf-8"?>
+<file path=customXml/itemProps4.xml><?xml version="1.0" encoding="utf-8"?>
 <ds:datastoreItem xmlns:ds="http://schemas.openxmlformats.org/officeDocument/2006/customXml" ds:itemID="{E01C4D31-F5BF-4169-92BB-33EB44164409}">
   <ds:schemaRefs>
     <ds:schemaRef ds:uri="http://schemas.microsoft.com/office/2006/metadata/properties"/>
@@ -3113,12 +3093,4 @@
     <ds:schemaRef ds:uri="b00ac6d6-80cd-413d-830d-913bbb25803f"/>
   </ds:schemaRefs>
 </ds:datastoreItem>
-</file>
-
-<file path=customXml/itemProps4.xml><?xml version="1.0" encoding="utf-8"?>
-<ds:datastoreItem xmlns:ds="http://schemas.openxmlformats.org/officeDocument/2006/customXml" ds:itemID="{B40BDD30-5C6F-4CE7-A239-E1CC62841014}">
-  <ds:schemaRefs>
-    <ds:schemaRef ds:uri="http://schemas.microsoft.com/sharepoint/v3/contenttype/forms"/>
-  </ds:schemaRefs>
-</ds:datastoreItem>
 </file>
</xml_diff>

<commit_message>
Supprime l'img de couverture d'un ouvrage lors de la supression de ce dernier
</commit_message>
<xml_diff>
--- a/Rapport de projet 151.docx
+++ b/Rapport de projet 151.docx
@@ -1796,6 +1796,11 @@
       </w:hyperlink>
     </w:p>
     <w:p>
+      <w:pPr>
+        <w:rPr>
+          <w:rStyle w:val="Lienhypertexte"/>
+        </w:rPr>
+      </w:pPr>
       <w:hyperlink r:id="rId17" w:history="1">
         <w:r>
           <w:rPr>
@@ -1805,6 +1810,17 @@
         </w:r>
       </w:hyperlink>
     </w:p>
+    <w:p>
+      <w:hyperlink r:id="rId18" w:history="1">
+        <w:r>
+          <w:rPr>
+            <w:rStyle w:val="Lienhypertexte"/>
+          </w:rPr>
+          <w:t>https://www.php.net/manual/fr/function.unlink.php</w:t>
+        </w:r>
+      </w:hyperlink>
+    </w:p>
+    <w:p/>
     <w:p/>
     <w:p/>
     <w:sectPr>
@@ -2777,10 +2793,6 @@
 </file>
 
 <file path=customXml/item1.xml><?xml version="1.0" encoding="utf-8"?>
-<b:Sources xmlns:b="http://schemas.openxmlformats.org/officeDocument/2006/bibliography" xmlns="http://schemas.openxmlformats.org/officeDocument/2006/bibliography" SelectedStyle="\APASixthEditionOfficeOnline.xsl" StyleName="APA" Version="6"/>
-</file>
-
-<file path=customXml/item2.xml><?xml version="1.0" encoding="utf-8"?>
 <ct:contentTypeSchema xmlns:ct="http://schemas.microsoft.com/office/2006/metadata/contentType" xmlns:ma="http://schemas.microsoft.com/office/2006/metadata/properties/metaAttributes" ct:_="" ma:_="" ma:contentTypeName="Document" ma:contentTypeID="0x0101002111B0F6B9A4254395AB1DB111DB9386" ma:contentTypeVersion="18" ma:contentTypeDescription="Crée un document." ma:contentTypeScope="" ma:versionID="d9d6e71f22ffe43e2c52599b455c7b25">
   <xsd:schema xmlns:xsd="http://www.w3.org/2001/XMLSchema" xmlns:xs="http://www.w3.org/2001/XMLSchema" xmlns:p="http://schemas.microsoft.com/office/2006/metadata/properties" xmlns:ns3="b00ac6d6-80cd-413d-830d-913bbb25803f" xmlns:ns4="ee80aa89-3e9c-4f48-b6f7-2e434b001f62" targetNamespace="http://schemas.microsoft.com/office/2006/metadata/properties" ma:root="true" ma:fieldsID="ed733014cbd63336034cb6a2706260a3" ns3:_="" ns4:_="">
     <xsd:import namespace="b00ac6d6-80cd-413d-830d-913bbb25803f"/>
@@ -3033,7 +3045,19 @@
 </ct:contentTypeSchema>
 </file>
 
+<file path=customXml/item2.xml><?xml version="1.0" encoding="utf-8"?>
+<b:Sources xmlns:b="http://schemas.openxmlformats.org/officeDocument/2006/bibliography" xmlns="http://schemas.openxmlformats.org/officeDocument/2006/bibliography" SelectedStyle="\APASixthEditionOfficeOnline.xsl" StyleName="APA" Version="6"/>
+</file>
+
 <file path=customXml/item3.xml><?xml version="1.0" encoding="utf-8"?>
+<p:properties xmlns:p="http://schemas.microsoft.com/office/2006/metadata/properties" xmlns:xsi="http://www.w3.org/2001/XMLSchema-instance" xmlns:pc="http://schemas.microsoft.com/office/infopath/2007/PartnerControls">
+  <documentManagement>
+    <_activity xmlns="b00ac6d6-80cd-413d-830d-913bbb25803f" xsi:nil="true"/>
+  </documentManagement>
+</p:properties>
+</file>
+
+<file path=customXml/item4.xml><?xml version="1.0" encoding="utf-8"?>
 <?mso-contentType ?>
 <FormTemplates xmlns="http://schemas.microsoft.com/sharepoint/v3/contenttype/forms">
   <Display>DocumentLibraryForm</Display>
@@ -3042,23 +3066,7 @@
 </FormTemplates>
 </file>
 
-<file path=customXml/item4.xml><?xml version="1.0" encoding="utf-8"?>
-<p:properties xmlns:p="http://schemas.microsoft.com/office/2006/metadata/properties" xmlns:xsi="http://www.w3.org/2001/XMLSchema-instance" xmlns:pc="http://schemas.microsoft.com/office/infopath/2007/PartnerControls">
-  <documentManagement>
-    <_activity xmlns="b00ac6d6-80cd-413d-830d-913bbb25803f" xsi:nil="true"/>
-  </documentManagement>
-</p:properties>
-</file>
-
 <file path=customXml/itemProps1.xml><?xml version="1.0" encoding="utf-8"?>
-<ds:datastoreItem xmlns:ds="http://schemas.openxmlformats.org/officeDocument/2006/customXml" ds:itemID="{D0F41924-4BEF-4C66-BDA8-2632E4D4AC33}">
-  <ds:schemaRefs>
-    <ds:schemaRef ds:uri="http://schemas.openxmlformats.org/officeDocument/2006/bibliography"/>
-  </ds:schemaRefs>
-</ds:datastoreItem>
-</file>
-
-<file path=customXml/itemProps2.xml><?xml version="1.0" encoding="utf-8"?>
 <ds:datastoreItem xmlns:ds="http://schemas.openxmlformats.org/officeDocument/2006/customXml" ds:itemID="{C2DA5A2D-E6AE-4CF1-8B69-DF89A60A1EBF}">
   <ds:schemaRefs>
     <ds:schemaRef ds:uri="http://schemas.microsoft.com/office/2006/metadata/contentType"/>
@@ -3077,15 +3085,15 @@
 </ds:datastoreItem>
 </file>
 
-<file path=customXml/itemProps3.xml><?xml version="1.0" encoding="utf-8"?>
-<ds:datastoreItem xmlns:ds="http://schemas.openxmlformats.org/officeDocument/2006/customXml" ds:itemID="{B40BDD30-5C6F-4CE7-A239-E1CC62841014}">
+<file path=customXml/itemProps2.xml><?xml version="1.0" encoding="utf-8"?>
+<ds:datastoreItem xmlns:ds="http://schemas.openxmlformats.org/officeDocument/2006/customXml" ds:itemID="{D0F41924-4BEF-4C66-BDA8-2632E4D4AC33}">
   <ds:schemaRefs>
-    <ds:schemaRef ds:uri="http://schemas.microsoft.com/sharepoint/v3/contenttype/forms"/>
+    <ds:schemaRef ds:uri="http://schemas.openxmlformats.org/officeDocument/2006/bibliography"/>
   </ds:schemaRefs>
 </ds:datastoreItem>
 </file>
 
-<file path=customXml/itemProps4.xml><?xml version="1.0" encoding="utf-8"?>
+<file path=customXml/itemProps3.xml><?xml version="1.0" encoding="utf-8"?>
 <ds:datastoreItem xmlns:ds="http://schemas.openxmlformats.org/officeDocument/2006/customXml" ds:itemID="{E01C4D31-F5BF-4169-92BB-33EB44164409}">
   <ds:schemaRefs>
     <ds:schemaRef ds:uri="http://schemas.microsoft.com/office/2006/metadata/properties"/>
@@ -3093,4 +3101,12 @@
     <ds:schemaRef ds:uri="b00ac6d6-80cd-413d-830d-913bbb25803f"/>
   </ds:schemaRefs>
 </ds:datastoreItem>
+</file>
+
+<file path=customXml/itemProps4.xml><?xml version="1.0" encoding="utf-8"?>
+<ds:datastoreItem xmlns:ds="http://schemas.openxmlformats.org/officeDocument/2006/customXml" ds:itemID="{B40BDD30-5C6F-4CE7-A239-E1CC62841014}">
+  <ds:schemaRefs>
+    <ds:schemaRef ds:uri="http://schemas.microsoft.com/sharepoint/v3/contenttype/forms"/>
+  </ds:schemaRefs>
+</ds:datastoreItem>
 </file>
</xml_diff>

<commit_message>
UI : Changement footer + amélioration du code (echo )
</commit_message>
<xml_diff>
--- a/Rapport de projet 151.docx
+++ b/Rapport de projet 151.docx
@@ -1534,6 +1534,23 @@
       </w:r>
       <w:bookmarkEnd w:id="11"/>
     </w:p>
+    <w:p/>
+    <w:p>
+      <w:r>
+        <w:t xml:space="preserve">3, </w:t>
+      </w:r>
+      <w:r>
+        <w:rPr>
+          <w:b/>
+          <w:bCs/>
+          <w:color w:val="FF0000"/>
+        </w:rPr>
+        <w:t>27</w:t>
+      </w:r>
+      <w:r>
+        <w:t xml:space="preserve">, </w:t>
+      </w:r>
+    </w:p>
     <w:p>
       <w:pPr>
         <w:pStyle w:val="Titre1"/>
@@ -1590,8 +1607,13 @@
       <w:bookmarkEnd w:id="16"/>
     </w:p>
     <w:p>
-      <w:r>
-        <w:t xml:space="preserve">Tailwind CSS, </w:t>
+      <w:proofErr w:type="spellStart"/>
+      <w:r>
+        <w:t>Tailwind</w:t>
+      </w:r>
+      <w:proofErr w:type="spellEnd"/>
+      <w:r>
+        <w:t xml:space="preserve"> CSS, </w:t>
       </w:r>
       <w:hyperlink r:id="rId8" w:history="1">
         <w:r>
@@ -1613,8 +1635,13 @@
       </w:r>
     </w:p>
     <w:p>
-      <w:r>
-        <w:t xml:space="preserve">TailwinUI, </w:t>
+      <w:proofErr w:type="spellStart"/>
+      <w:r>
+        <w:t>TailwinUI</w:t>
+      </w:r>
+      <w:proofErr w:type="spellEnd"/>
+      <w:r>
+        <w:t xml:space="preserve">, </w:t>
       </w:r>
       <w:hyperlink r:id="rId9" w:history="1">
         <w:r>
@@ -1632,8 +1659,13 @@
       </w:r>
     </w:p>
     <w:p>
-      <w:r>
-        <w:t xml:space="preserve">ChatGPT, </w:t>
+      <w:proofErr w:type="spellStart"/>
+      <w:r>
+        <w:t>ChatGPT</w:t>
+      </w:r>
+      <w:proofErr w:type="spellEnd"/>
+      <w:r>
+        <w:t xml:space="preserve">, </w:t>
       </w:r>
       <w:hyperlink r:id="rId10" w:history="1">
         <w:r>
@@ -1698,7 +1730,23 @@
             <w:rStyle w:val="Lienhypertexte"/>
             <w:lang w:val="en-US"/>
           </w:rPr>
-          <w:t>How To Create a Search Bar</w:t>
+          <w:t xml:space="preserve">How </w:t>
+        </w:r>
+        <w:proofErr w:type="gramStart"/>
+        <w:r>
+          <w:rPr>
+            <w:rStyle w:val="Lienhypertexte"/>
+            <w:lang w:val="en-US"/>
+          </w:rPr>
+          <w:t>To</w:t>
+        </w:r>
+        <w:proofErr w:type="gramEnd"/>
+        <w:r>
+          <w:rPr>
+            <w:rStyle w:val="Lienhypertexte"/>
+            <w:lang w:val="en-US"/>
+          </w:rPr>
+          <w:t xml:space="preserve"> Create a Search Bar</w:t>
         </w:r>
       </w:hyperlink>
       <w:r>
@@ -1707,11 +1755,19 @@
         </w:rPr>
         <w:t xml:space="preserve">, </w:t>
       </w:r>
+      <w:proofErr w:type="spellStart"/>
       <w:r>
         <w:rPr>
           <w:lang w:val="en-US"/>
         </w:rPr>
-        <w:t>consulté le 25.11.2024</w:t>
+        <w:t>consulté</w:t>
+      </w:r>
+      <w:proofErr w:type="spellEnd"/>
+      <w:r>
+        <w:rPr>
+          <w:lang w:val="en-US"/>
+        </w:rPr>
+        <w:t xml:space="preserve"> le 25.11.2024</w:t>
       </w:r>
       <w:r>
         <w:rPr>
@@ -1721,6 +1777,7 @@
       </w:r>
     </w:p>
     <w:p>
+      <w:proofErr w:type="spellStart"/>
       <w:r>
         <w:t>Delf</w:t>
       </w:r>
@@ -1728,7 +1785,11 @@
         <w:t>S</w:t>
       </w:r>
       <w:r>
-        <w:t xml:space="preserve">tack, </w:t>
+        <w:t>tack</w:t>
+      </w:r>
+      <w:proofErr w:type="spellEnd"/>
+      <w:r>
+        <w:t xml:space="preserve">, </w:t>
       </w:r>
       <w:hyperlink r:id="rId13" w:anchor=":~:text=Dans%20ce%20tutoriel%2C%20nous%20visons%20%C3%A0%20apprendre%20%C3%A0,donn%C3%A9e%20comme%20SELECT%20IF%28condition%2C%20result_when_true%2C%20result_when_false%29%20AS%20%5Bcol_name%5D." w:history="1">
         <w:r>
@@ -2793,6 +2854,10 @@
 </file>
 
 <file path=customXml/item1.xml><?xml version="1.0" encoding="utf-8"?>
+<b:Sources xmlns:b="http://schemas.openxmlformats.org/officeDocument/2006/bibliography" xmlns="http://schemas.openxmlformats.org/officeDocument/2006/bibliography" SelectedStyle="\APASixthEditionOfficeOnline.xsl" StyleName="APA" Version="6"/>
+</file>
+
+<file path=customXml/item2.xml><?xml version="1.0" encoding="utf-8"?>
 <ct:contentTypeSchema xmlns:ct="http://schemas.microsoft.com/office/2006/metadata/contentType" xmlns:ma="http://schemas.microsoft.com/office/2006/metadata/properties/metaAttributes" ct:_="" ma:_="" ma:contentTypeName="Document" ma:contentTypeID="0x0101002111B0F6B9A4254395AB1DB111DB9386" ma:contentTypeVersion="18" ma:contentTypeDescription="Crée un document." ma:contentTypeScope="" ma:versionID="d9d6e71f22ffe43e2c52599b455c7b25">
   <xsd:schema xmlns:xsd="http://www.w3.org/2001/XMLSchema" xmlns:xs="http://www.w3.org/2001/XMLSchema" xmlns:p="http://schemas.microsoft.com/office/2006/metadata/properties" xmlns:ns3="b00ac6d6-80cd-413d-830d-913bbb25803f" xmlns:ns4="ee80aa89-3e9c-4f48-b6f7-2e434b001f62" targetNamespace="http://schemas.microsoft.com/office/2006/metadata/properties" ma:root="true" ma:fieldsID="ed733014cbd63336034cb6a2706260a3" ns3:_="" ns4:_="">
     <xsd:import namespace="b00ac6d6-80cd-413d-830d-913bbb25803f"/>
@@ -3045,19 +3110,7 @@
 </ct:contentTypeSchema>
 </file>
 
-<file path=customXml/item2.xml><?xml version="1.0" encoding="utf-8"?>
-<b:Sources xmlns:b="http://schemas.openxmlformats.org/officeDocument/2006/bibliography" xmlns="http://schemas.openxmlformats.org/officeDocument/2006/bibliography" SelectedStyle="\APASixthEditionOfficeOnline.xsl" StyleName="APA" Version="6"/>
-</file>
-
 <file path=customXml/item3.xml><?xml version="1.0" encoding="utf-8"?>
-<p:properties xmlns:p="http://schemas.microsoft.com/office/2006/metadata/properties" xmlns:xsi="http://www.w3.org/2001/XMLSchema-instance" xmlns:pc="http://schemas.microsoft.com/office/infopath/2007/PartnerControls">
-  <documentManagement>
-    <_activity xmlns="b00ac6d6-80cd-413d-830d-913bbb25803f" xsi:nil="true"/>
-  </documentManagement>
-</p:properties>
-</file>
-
-<file path=customXml/item4.xml><?xml version="1.0" encoding="utf-8"?>
 <?mso-contentType ?>
 <FormTemplates xmlns="http://schemas.microsoft.com/sharepoint/v3/contenttype/forms">
   <Display>DocumentLibraryForm</Display>
@@ -3066,7 +3119,23 @@
 </FormTemplates>
 </file>
 
+<file path=customXml/item4.xml><?xml version="1.0" encoding="utf-8"?>
+<p:properties xmlns:p="http://schemas.microsoft.com/office/2006/metadata/properties" xmlns:xsi="http://www.w3.org/2001/XMLSchema-instance" xmlns:pc="http://schemas.microsoft.com/office/infopath/2007/PartnerControls">
+  <documentManagement>
+    <_activity xmlns="b00ac6d6-80cd-413d-830d-913bbb25803f" xsi:nil="true"/>
+  </documentManagement>
+</p:properties>
+</file>
+
 <file path=customXml/itemProps1.xml><?xml version="1.0" encoding="utf-8"?>
+<ds:datastoreItem xmlns:ds="http://schemas.openxmlformats.org/officeDocument/2006/customXml" ds:itemID="{D0F41924-4BEF-4C66-BDA8-2632E4D4AC33}">
+  <ds:schemaRefs>
+    <ds:schemaRef ds:uri="http://schemas.openxmlformats.org/officeDocument/2006/bibliography"/>
+  </ds:schemaRefs>
+</ds:datastoreItem>
+</file>
+
+<file path=customXml/itemProps2.xml><?xml version="1.0" encoding="utf-8"?>
 <ds:datastoreItem xmlns:ds="http://schemas.openxmlformats.org/officeDocument/2006/customXml" ds:itemID="{C2DA5A2D-E6AE-4CF1-8B69-DF89A60A1EBF}">
   <ds:schemaRefs>
     <ds:schemaRef ds:uri="http://schemas.microsoft.com/office/2006/metadata/contentType"/>
@@ -3085,15 +3154,15 @@
 </ds:datastoreItem>
 </file>
 
-<file path=customXml/itemProps2.xml><?xml version="1.0" encoding="utf-8"?>
-<ds:datastoreItem xmlns:ds="http://schemas.openxmlformats.org/officeDocument/2006/customXml" ds:itemID="{D0F41924-4BEF-4C66-BDA8-2632E4D4AC33}">
+<file path=customXml/itemProps3.xml><?xml version="1.0" encoding="utf-8"?>
+<ds:datastoreItem xmlns:ds="http://schemas.openxmlformats.org/officeDocument/2006/customXml" ds:itemID="{B40BDD30-5C6F-4CE7-A239-E1CC62841014}">
   <ds:schemaRefs>
-    <ds:schemaRef ds:uri="http://schemas.openxmlformats.org/officeDocument/2006/bibliography"/>
+    <ds:schemaRef ds:uri="http://schemas.microsoft.com/sharepoint/v3/contenttype/forms"/>
   </ds:schemaRefs>
 </ds:datastoreItem>
 </file>
 
-<file path=customXml/itemProps3.xml><?xml version="1.0" encoding="utf-8"?>
+<file path=customXml/itemProps4.xml><?xml version="1.0" encoding="utf-8"?>
 <ds:datastoreItem xmlns:ds="http://schemas.openxmlformats.org/officeDocument/2006/customXml" ds:itemID="{E01C4D31-F5BF-4169-92BB-33EB44164409}">
   <ds:schemaRefs>
     <ds:schemaRef ds:uri="http://schemas.microsoft.com/office/2006/metadata/properties"/>
@@ -3101,12 +3170,4 @@
     <ds:schemaRef ds:uri="b00ac6d6-80cd-413d-830d-913bbb25803f"/>
   </ds:schemaRefs>
 </ds:datastoreItem>
-</file>
-
-<file path=customXml/itemProps4.xml><?xml version="1.0" encoding="utf-8"?>
-<ds:datastoreItem xmlns:ds="http://schemas.openxmlformats.org/officeDocument/2006/customXml" ds:itemID="{B40BDD30-5C6F-4CE7-A239-E1CC62841014}">
-  <ds:schemaRefs>
-    <ds:schemaRef ds:uri="http://schemas.microsoft.com/sharepoint/v3/contenttype/forms"/>
-  </ds:schemaRefs>
-</ds:datastoreItem>
 </file>
</xml_diff>

<commit_message>
doc : Ajouter conclusion général, explication methode, diagramme de Db
</commit_message>
<xml_diff>
--- a/Rapport de projet 151.docx
+++ b/Rapport de projet 151.docx
@@ -26,21 +26,8 @@
           <w:docGrid w:linePitch="360"/>
         </w:sectPr>
       </w:pPr>
-      <w:proofErr w:type="spellStart"/>
-      <w:r>
-        <w:t>Kaeno</w:t>
-      </w:r>
-      <w:proofErr w:type="spellEnd"/>
-      <w:r>
-        <w:t xml:space="preserve"> </w:t>
-      </w:r>
-      <w:proofErr w:type="spellStart"/>
-      <w:r>
-        <w:t>Eyer</w:t>
-      </w:r>
-      <w:proofErr w:type="spellEnd"/>
-      <w:r>
-        <w:t>, Mustafa Yildiz</w:t>
+      <w:r>
+        <w:t>Kaeno Eyer, Mustafa Yildiz</w:t>
       </w:r>
       <w:r>
         <w:t>, Omar Egal Ahmed</w:t>
@@ -1470,7 +1457,45 @@
       </w:r>
       <w:bookmarkEnd w:id="4"/>
     </w:p>
-    <w:p/>
+    <w:p>
+      <w:r>
+        <w:drawing>
+          <wp:inline distT="0" distB="0" distL="0" distR="0" wp14:anchorId="01CBCD60" wp14:editId="1CD8CD52">
+            <wp:extent cx="5760720" cy="2512695"/>
+            <wp:effectExtent l="0" t="0" r="0" b="1905"/>
+            <wp:docPr id="2118551686" name="Image 1" descr="Une image contenant texte, capture d’écran, diagramme, ligne&#10;&#10;Description générée automatiquement"/>
+            <wp:cNvGraphicFramePr>
+              <a:graphicFrameLocks xmlns:a="http://schemas.openxmlformats.org/drawingml/2006/main" noChangeAspect="1"/>
+            </wp:cNvGraphicFramePr>
+            <a:graphic xmlns:a="http://schemas.openxmlformats.org/drawingml/2006/main">
+              <a:graphicData uri="http://schemas.openxmlformats.org/drawingml/2006/picture">
+                <pic:pic xmlns:pic="http://schemas.openxmlformats.org/drawingml/2006/picture">
+                  <pic:nvPicPr>
+                    <pic:cNvPr id="2118551686" name="Image 1" descr="Une image contenant texte, capture d’écran, diagramme, ligne&#10;&#10;Description générée automatiquement"/>
+                    <pic:cNvPicPr/>
+                  </pic:nvPicPr>
+                  <pic:blipFill>
+                    <a:blip r:embed="rId8"/>
+                    <a:stretch>
+                      <a:fillRect/>
+                    </a:stretch>
+                  </pic:blipFill>
+                  <pic:spPr>
+                    <a:xfrm>
+                      <a:off x="0" y="0"/>
+                      <a:ext cx="5760720" cy="2512695"/>
+                    </a:xfrm>
+                    <a:prstGeom prst="rect">
+                      <a:avLst/>
+                    </a:prstGeom>
+                  </pic:spPr>
+                </pic:pic>
+              </a:graphicData>
+            </a:graphic>
+          </wp:inline>
+        </w:drawing>
+      </w:r>
+    </w:p>
     <w:p>
       <w:pPr>
         <w:pStyle w:val="Titre1"/>
@@ -1549,6 +1574,60 @@
     </w:p>
     <w:p>
       <w:pPr>
+        <w:pStyle w:val="Titre2"/>
+      </w:pPr>
+      <w:r>
+        <w:t>Explication méthode de projet</w:t>
+      </w:r>
+    </w:p>
+    <w:p>
+      <w:r>
+        <w:t>Notre équipe sont autonomes et travaillent ensemble pour atteindre</w:t>
+      </w:r>
+      <w:r>
+        <w:t xml:space="preserve"> </w:t>
+      </w:r>
+      <w:r>
+        <w:t>notre</w:t>
+      </w:r>
+      <w:r>
+        <w:t xml:space="preserve"> </w:t>
+      </w:r>
+      <w:r>
+        <w:t>objectif</w:t>
+      </w:r>
+      <w:r>
+        <w:t>.</w:t>
+      </w:r>
+      <w:r>
+        <w:t xml:space="preserve"> </w:t>
+      </w:r>
+      <w:r>
+        <w:t xml:space="preserve"> Le produit est développé par itérations courtes appelées daily scrum deux fois par semaine dans la </w:t>
+      </w:r>
+      <w:r>
+        <w:t>leçon</w:t>
+      </w:r>
+      <w:r>
+        <w:t xml:space="preserve">. </w:t>
+      </w:r>
+      <w:r>
+        <w:t>Chaque daily scrum, l'équipe analyse ce qui a bien fonctionné et ce qui doit être amélioré.</w:t>
+      </w:r>
+    </w:p>
+    <w:p>
+      <w:r>
+        <w:t>On utilisé que la méthode SMART est une approche utilisée pour définir des objectifs clairs et atteignables dans notre projet.</w:t>
+      </w:r>
+      <w:r>
+        <w:t xml:space="preserve"> </w:t>
+      </w:r>
+      <w:r>
+        <w:t>Lors de la définition des tâches, nous avons veillé à ce qu'elles soient spécifiques, précises, mesurables, acceptables et réalisables, et nous avons planifié toutes les tâches dans un délai donné.</w:t>
+      </w:r>
+    </w:p>
+    <w:p>
+      <w:pPr>
         <w:pStyle w:val="Titre1"/>
       </w:pPr>
       <w:bookmarkStart w:id="12" w:name="_Toc183417740"/>
@@ -1568,7 +1647,28 @@
       </w:r>
       <w:bookmarkEnd w:id="13"/>
     </w:p>
-    <w:p/>
+    <w:p>
+      <w:r>
+        <w:t xml:space="preserve">Lors de la création de notre application web Passion Lecture, nous avons utilisé des ordinateurs Windows 10 utilisés à l'école et nos ordinateurs personnels à la maison. Nous avons écrit nos codes avec Visual studio code. Nous avons fait le développement et le stockage du projet dans le dépôt </w:t>
+      </w:r>
+      <w:r>
+        <w:t>G</w:t>
+      </w:r>
+      <w:r>
+        <w:t>ithub. Nous avons utilisé Objective Smart et la méthodologie Scrum. Nous avons conçu le modèle avec Figma. Comme éco-conception, nous avons suivi la « Règle n° 3 - Le code source de chaque page contient une métadonnée qui en décrit le contenu ».</w:t>
+      </w:r>
+    </w:p>
+    <w:p>
+      <w:r>
+        <w:t xml:space="preserve">Sur notre page d'accueil, vous verrez les 5 livres les plus récemment ajoutés. Nous avons une page où les livres sont listés par catégorie, d'autres pages pour ajouter des livres, modifier des informations, commenter des livres et supprimer des livres. Deux types de profils d'utilisateurs ont été créés : les administrateurs et les utilisateurs. </w:t>
+      </w:r>
+      <w:r>
+        <w:t>S</w:t>
+      </w:r>
+      <w:r>
+        <w:t>ans créer un compte ou se connecter, il n'est pas possible d'ajouter des livres, de supprimer des livres, d'apporter des modifications et d'écrire des commentaires. vous pouvez noter les livres sur 5 étoiles et les évaluer en écrivant des commentaires.</w:t>
+      </w:r>
+    </w:p>
     <w:p>
       <w:pPr>
         <w:pStyle w:val="Titre2"/>
@@ -1579,7 +1679,11 @@
       </w:r>
       <w:bookmarkEnd w:id="14"/>
     </w:p>
-    <w:p/>
+    <w:p>
+      <w:r>
+        <w:t>Grâce à ce projet, nous avons eu l'occasion et l'expérience de créer des applications avec un travail de groupe en établissant une bonne communication. Nous avons eu l'occasion de mettre en pratique les connaissances théoriques que nous avons apprises dans les leçons et de développer des connaissances pratiques. Dès le premier jour du projet, nous avons établi une bonne coopération et une bonne communication, partagé les tâches et vérifié l'avancement du projet en organisant des réunions régulières. Lorsque nous étions bloqués et que nous avions des problèmes, nous nous sommes aidés les uns les autres. Nous avons réalisé un bon travail d'équipe.</w:t>
+      </w:r>
+    </w:p>
     <w:p>
       <w:pPr>
         <w:pStyle w:val="Titre2"/>
@@ -1590,7 +1694,17 @@
       </w:r>
       <w:bookmarkEnd w:id="15"/>
     </w:p>
-    <w:p/>
+    <w:p>
+      <w:r>
+        <w:t>Je pense que c'est une application intéressante et très utile. Si l'on disposait d'un peu plus de temps, on pourrait la rendre plus esthétique et plus belle visuellement et y inclure diverses fonctionnalités. Les progrès sont réalisés grâce à une bonne et efficace coordination entre l’équipe de développement.</w:t>
+      </w:r>
+      <w:r>
+        <w:t xml:space="preserve"> </w:t>
+      </w:r>
+      <w:r>
+        <w:t>La répartition des tâches a été effectuée avec soin, en tenant compte des capacités et des compétences.</w:t>
+      </w:r>
+    </w:p>
     <w:p>
       <w:pPr>
         <w:pStyle w:val="Titre1"/>
@@ -1603,15 +1717,10 @@
       <w:bookmarkEnd w:id="16"/>
     </w:p>
     <w:p>
-      <w:proofErr w:type="spellStart"/>
-      <w:r>
-        <w:t>Tailwind</w:t>
-      </w:r>
-      <w:proofErr w:type="spellEnd"/>
-      <w:r>
-        <w:t xml:space="preserve"> CSS, </w:t>
-      </w:r>
-      <w:hyperlink r:id="rId8" w:history="1">
+      <w:r>
+        <w:t xml:space="preserve">Tailwind CSS, </w:t>
+      </w:r>
+      <w:hyperlink r:id="rId9" w:history="1">
         <w:r>
           <w:rPr>
             <w:rStyle w:val="Lienhypertexte"/>
@@ -1631,15 +1740,10 @@
       </w:r>
     </w:p>
     <w:p>
-      <w:proofErr w:type="spellStart"/>
-      <w:r>
-        <w:t>TailwinUI</w:t>
-      </w:r>
-      <w:proofErr w:type="spellEnd"/>
-      <w:r>
-        <w:t xml:space="preserve">, </w:t>
-      </w:r>
-      <w:hyperlink r:id="rId9" w:history="1">
+      <w:r>
+        <w:t xml:space="preserve">TailwinUI, </w:t>
+      </w:r>
+      <w:hyperlink r:id="rId10" w:history="1">
         <w:r>
           <w:rPr>
             <w:rStyle w:val="Lienhypertexte"/>
@@ -1655,15 +1759,10 @@
       </w:r>
     </w:p>
     <w:p>
-      <w:proofErr w:type="spellStart"/>
-      <w:r>
-        <w:t>ChatGPT</w:t>
-      </w:r>
-      <w:proofErr w:type="spellEnd"/>
-      <w:r>
-        <w:t xml:space="preserve">, </w:t>
-      </w:r>
-      <w:hyperlink r:id="rId10" w:history="1">
+      <w:r>
+        <w:t xml:space="preserve">ChatGPT, </w:t>
+      </w:r>
+      <w:hyperlink r:id="rId11" w:history="1">
         <w:r>
           <w:rPr>
             <w:rStyle w:val="Lienhypertexte"/>
@@ -1687,7 +1786,7 @@
       <w:r>
         <w:t xml:space="preserve">Icons8, </w:t>
       </w:r>
-      <w:hyperlink r:id="rId11" w:history="1">
+      <w:hyperlink r:id="rId12" w:history="1">
         <w:r>
           <w:rPr>
             <w:rStyle w:val="Lienhypertexte"/>
@@ -1720,29 +1819,13 @@
         </w:rPr>
         <w:t xml:space="preserve">Schools, </w:t>
       </w:r>
-      <w:hyperlink r:id="rId12" w:tgtFrame="_blank" w:history="1">
+      <w:hyperlink r:id="rId13" w:tgtFrame="_blank" w:history="1">
         <w:r>
           <w:rPr>
             <w:rStyle w:val="Lienhypertexte"/>
             <w:lang w:val="en-US"/>
           </w:rPr>
-          <w:t xml:space="preserve">How </w:t>
-        </w:r>
-        <w:proofErr w:type="gramStart"/>
-        <w:r>
-          <w:rPr>
-            <w:rStyle w:val="Lienhypertexte"/>
-            <w:lang w:val="en-US"/>
-          </w:rPr>
-          <w:t>To</w:t>
-        </w:r>
-        <w:proofErr w:type="gramEnd"/>
-        <w:r>
-          <w:rPr>
-            <w:rStyle w:val="Lienhypertexte"/>
-            <w:lang w:val="en-US"/>
-          </w:rPr>
-          <w:t xml:space="preserve"> Create a Search Bar</w:t>
+          <w:t>How To Create a Search Bar</w:t>
         </w:r>
       </w:hyperlink>
       <w:r>
@@ -1751,19 +1834,11 @@
         </w:rPr>
         <w:t xml:space="preserve">, </w:t>
       </w:r>
-      <w:proofErr w:type="spellStart"/>
       <w:r>
         <w:rPr>
           <w:lang w:val="en-US"/>
         </w:rPr>
-        <w:t>consulté</w:t>
-      </w:r>
-      <w:proofErr w:type="spellEnd"/>
-      <w:r>
-        <w:rPr>
-          <w:lang w:val="en-US"/>
-        </w:rPr>
-        <w:t xml:space="preserve"> le 25.11.2024</w:t>
+        <w:t>consulté le 25.11.2024</w:t>
       </w:r>
       <w:r>
         <w:rPr>
@@ -1773,7 +1848,6 @@
       </w:r>
     </w:p>
     <w:p>
-      <w:proofErr w:type="spellStart"/>
       <w:r>
         <w:t>Delf</w:t>
       </w:r>
@@ -1781,13 +1855,9 @@
         <w:t>S</w:t>
       </w:r>
       <w:r>
-        <w:t>tack</w:t>
-      </w:r>
-      <w:proofErr w:type="spellEnd"/>
-      <w:r>
-        <w:t xml:space="preserve">, </w:t>
-      </w:r>
-      <w:hyperlink r:id="rId13" w:anchor=":~:text=Dans%20ce%20tutoriel%2C%20nous%20visons%20%C3%A0%20apprendre%20%C3%A0,donn%C3%A9e%20comme%20SELECT%20IF%28condition%2C%20result_when_true%2C%20result_when_false%29%20AS%20%5Bcol_name%5D." w:history="1">
+        <w:t xml:space="preserve">tack, </w:t>
+      </w:r>
+      <w:hyperlink r:id="rId14" w:anchor=":~:text=Dans%20ce%20tutoriel%2C%20nous%20visons%20%C3%A0%20apprendre%20%C3%A0,donn%C3%A9e%20comme%20SELECT%20IF%28condition%2C%20result_when_true%2C%20result_when_false%29%20AS%20%5Bcol_name%5D." w:history="1">
         <w:r>
           <w:rPr>
             <w:rStyle w:val="Lienhypertexte"/>
@@ -1815,7 +1885,7 @@
       <w:r>
         <w:t xml:space="preserve">, </w:t>
       </w:r>
-      <w:hyperlink r:id="rId14" w:anchor=":~:text=Pour%20cr%C3%A9er%20des%20conditions%20de%20filtrage%20encore%20plus,en%20SQL%20%3A%20PAS%20%E2%86%92%20ET%20%E2%86%92%20OU." w:history="1">
+      <w:hyperlink r:id="rId15" w:anchor=":~:text=Pour%20cr%C3%A9er%20des%20conditions%20de%20filtrage%20encore%20plus,en%20SQL%20%3A%20PAS%20%E2%86%92%20ET%20%E2%86%92%20OU." w:history="1">
         <w:r>
           <w:rPr>
             <w:rStyle w:val="Lienhypertexte"/>
@@ -1828,27 +1898,12 @@
       </w:r>
     </w:p>
     <w:p>
-      <w:hyperlink r:id="rId15" w:history="1">
+      <w:hyperlink r:id="rId16" w:history="1">
         <w:r>
           <w:rPr>
             <w:rStyle w:val="Lienhypertexte"/>
           </w:rPr>
           <w:t>https://sql.sh/fonctions/agregation/avg</w:t>
-        </w:r>
-      </w:hyperlink>
-    </w:p>
-    <w:p>
-      <w:pPr>
-        <w:rPr>
-          <w:rStyle w:val="Lienhypertexte"/>
-        </w:rPr>
-      </w:pPr>
-      <w:hyperlink r:id="rId16" w:history="1">
-        <w:r>
-          <w:rPr>
-            <w:rStyle w:val="Lienhypertexte"/>
-          </w:rPr>
-          <w:t>https://sql.sh/fonctions/round</w:t>
         </w:r>
       </w:hyperlink>
     </w:p>
@@ -1863,41 +1918,70 @@
           <w:rPr>
             <w:rStyle w:val="Lienhypertexte"/>
           </w:rPr>
-          <w:t>https://www.php.net/manual/fr/function.strlen.php</w:t>
+          <w:t>https://sql.sh/fonctions/round</w:t>
         </w:r>
       </w:hyperlink>
     </w:p>
     <w:p>
       <w:pPr>
         <w:rPr>
-          <w:lang w:val="en-US"/>
+          <w:rStyle w:val="Lienhypertexte"/>
         </w:rPr>
       </w:pPr>
       <w:hyperlink r:id="rId18" w:history="1">
         <w:r>
           <w:rPr>
             <w:rStyle w:val="Lienhypertexte"/>
-            <w:lang w:val="en-US"/>
           </w:rPr>
-          <w:t xml:space="preserve">Tailwind Modal Component — Tailwind CSS Components </w:t>
+          <w:t>https://www.php.net/manual/fr/function.strlen.php</w:t>
         </w:r>
-        <w:proofErr w:type="gramStart"/>
+      </w:hyperlink>
+    </w:p>
+    <w:p>
+      <w:pPr>
+        <w:rPr>
+          <w:rStyle w:val="Lienhypertexte"/>
+          <w:lang w:val="en-US"/>
+        </w:rPr>
+      </w:pPr>
+      <w:hyperlink r:id="rId19" w:history="1">
         <w:r>
           <w:rPr>
             <w:rStyle w:val="Lienhypertexte"/>
             <w:lang w:val="en-US"/>
           </w:rPr>
-          <w:t>( version</w:t>
+          <w:t>Tailwind Modal Component — Tailwind CSS Components ( version 4 update is here )</w:t>
         </w:r>
-        <w:proofErr w:type="gramEnd"/>
+      </w:hyperlink>
+    </w:p>
+    <w:p>
+      <w:pPr>
+        <w:rPr>
+          <w:lang w:val="en-US"/>
+        </w:rPr>
+      </w:pPr>
+      <w:hyperlink r:id="rId20" w:history="1">
         <w:r>
           <w:rPr>
             <w:rStyle w:val="Lienhypertexte"/>
             <w:lang w:val="en-US"/>
           </w:rPr>
-          <w:t xml:space="preserve"> 4 update is here )</w:t>
+          <w:t>https://www.deepl.com/</w:t>
         </w:r>
       </w:hyperlink>
+    </w:p>
+    <w:p>
+      <w:pPr>
+        <w:rPr>
+          <w:lang w:val="en-US"/>
+        </w:rPr>
+      </w:pPr>
+      <w:r>
+        <w:rPr>
+          <w:lang w:val="en-US"/>
+        </w:rPr>
+        <w:t>https://translate.google.com/</w:t>
+      </w:r>
     </w:p>
     <w:p>
       <w:pPr>
@@ -2882,12 +2966,7 @@
 </file>
 
 <file path=customXml/item1.xml><?xml version="1.0" encoding="utf-8"?>
-<?mso-contentType ?>
-<FormTemplates xmlns="http://schemas.microsoft.com/sharepoint/v3/contenttype/forms">
-  <Display>DocumentLibraryForm</Display>
-  <Edit>DocumentLibraryForm</Edit>
-  <New>DocumentLibraryForm</New>
-</FormTemplates>
+<b:Sources xmlns:b="http://schemas.openxmlformats.org/officeDocument/2006/bibliography" xmlns="http://schemas.openxmlformats.org/officeDocument/2006/bibliography" SelectedStyle="\APASixthEditionOfficeOnline.xsl" StyleName="APA" Version="6"/>
 </file>
 
 <file path=customXml/item2.xml><?xml version="1.0" encoding="utf-8"?>
@@ -3144,7 +3223,12 @@
 </file>
 
 <file path=customXml/item3.xml><?xml version="1.0" encoding="utf-8"?>
-<b:Sources xmlns:b="http://schemas.openxmlformats.org/officeDocument/2006/bibliography" xmlns="http://schemas.openxmlformats.org/officeDocument/2006/bibliography" SelectedStyle="\APASixthEditionOfficeOnline.xsl" StyleName="APA" Version="6"/>
+<?mso-contentType ?>
+<FormTemplates xmlns="http://schemas.microsoft.com/sharepoint/v3/contenttype/forms">
+  <Display>DocumentLibraryForm</Display>
+  <Edit>DocumentLibraryForm</Edit>
+  <New>DocumentLibraryForm</New>
+</FormTemplates>
 </file>
 
 <file path=customXml/item4.xml><?xml version="1.0" encoding="utf-8"?>
@@ -3156,9 +3240,9 @@
 </file>
 
 <file path=customXml/itemProps1.xml><?xml version="1.0" encoding="utf-8"?>
-<ds:datastoreItem xmlns:ds="http://schemas.openxmlformats.org/officeDocument/2006/customXml" ds:itemID="{B40BDD30-5C6F-4CE7-A239-E1CC62841014}">
+<ds:datastoreItem xmlns:ds="http://schemas.openxmlformats.org/officeDocument/2006/customXml" ds:itemID="{D0F41924-4BEF-4C66-BDA8-2632E4D4AC33}">
   <ds:schemaRefs>
-    <ds:schemaRef ds:uri="http://schemas.microsoft.com/sharepoint/v3/contenttype/forms"/>
+    <ds:schemaRef ds:uri="http://schemas.openxmlformats.org/officeDocument/2006/bibliography"/>
   </ds:schemaRefs>
 </ds:datastoreItem>
 </file>
@@ -3183,9 +3267,9 @@
 </file>
 
 <file path=customXml/itemProps3.xml><?xml version="1.0" encoding="utf-8"?>
-<ds:datastoreItem xmlns:ds="http://schemas.openxmlformats.org/officeDocument/2006/customXml" ds:itemID="{D0F41924-4BEF-4C66-BDA8-2632E4D4AC33}">
+<ds:datastoreItem xmlns:ds="http://schemas.openxmlformats.org/officeDocument/2006/customXml" ds:itemID="{B40BDD30-5C6F-4CE7-A239-E1CC62841014}">
   <ds:schemaRefs>
-    <ds:schemaRef ds:uri="http://schemas.openxmlformats.org/officeDocument/2006/bibliography"/>
+    <ds:schemaRef ds:uri="http://schemas.microsoft.com/sharepoint/v3/contenttype/forms"/>
   </ds:schemaRefs>
 </ds:datastoreItem>
 </file>

</xml_diff>